<commit_message>
docs: publish systematic review Word manuscript
Co-authored-by: Tao Zhang <zhangtaosia@users.noreply.github.com>
</commit_message>
<xml_diff>
--- a/docs/工业狭小空间几何测量方法研究进展.docx
+++ b/docs/工业狭小空间几何测量方法研究进展.docx
@@ -15,7 +15,7 @@
           <w:b/>
           <w:sz w:val="36"/>
         </w:rPr>
-        <w:t>工业狭小空间几何测量方法研究进展</w:t>
+        <w:t>工业狭小空间几何测量方法研究进展：系统性综述</w:t>
       </w:r>
     </w:p>
     <w:p>
@@ -35,7 +35,7 @@
     </w:p>
     <w:p>
       <w:pPr>
-        <w:spacing w:line="360" w:lineRule="auto" w:after="0" w:before="0"/>
+        <w:spacing w:line="360" w:lineRule="auto" w:before="0" w:after="0"/>
         <w:ind w:firstLine="420"/>
         <w:jc w:val="both"/>
       </w:pPr>
@@ -44,18 +44,19 @@
           <w:rFonts w:ascii="Times New Roman" w:hAnsi="Times New Roman" w:eastAsia="宋体"/>
           <w:sz w:val="21"/>
         </w:rPr>
-        <w:t>深孔、窄缝、管道、复杂流道和半封闭内腔广泛存在于航空发动机、能源装备、汽车动力系统及精密制造零部件中。受入口尺度小、深径比大、观测视场有限和测量基准难以传递等因素制约，常规坐标测量与表面测量装备难以直接应用。本文将工业狭小空间界定为受入口尺寸、内部尺度、深径比、遮挡或可达性限制，常规测量设备无法直接进入或建立完整测量视场的内部空间，综述接触式探针、内窥视觉和主动光学探头三类几何测量方法。首先，从几何任务、空间约束和计量性能三个维度建立方法分类框架；继而分析细长杆及微型探针、单/双目内窥视觉、激光三角与结构光、共焦和低相干干涉等方法的测量机理、代表性进展和适用边界；随后讨论探头微型化、光路折转、位姿与坐标传递、系统标定、多视场融合及不确定度评定等共性技术。在此基础上，采用可进入性、可达深度、测量范围、精度、覆盖率、表面适应性和测量效率等指标比较不同技术。研究表明，工业狭小空间测量的主要瓶颈已由局部传感分辨率转向探头全链位姿确定、深度相关误差补偿、复杂表面稳健感知以及任务相关量值溯源。多模态微型探头、原位自标定、结构约束融合和面向任务的不确定度数字化，是实现高精度、完整化和在线化测量的重要方向。</w:t>
+        <w:t>深孔、窄缝、管道、复杂流道和半封闭内腔广泛存在于航空发动机、能源装备、汽车动力系统及精密制造零部件中。受入口尺度、深径比、遮挡和测量基准传递限制，常规坐标与表面测量装备难以直接应用。为系统评价该领域的技术证据，本文围绕12组预设英文检索式开展系统化检索，并辅以前后向引文追踪；截至2026年7月17日，共导出1361条记录，经DOI和OpenAlex标识去重后得到1305条，题名规则筛选保留153条，经全文相关性与计量验证评估后纳入92篇原始研究，另纳入18项综述、方法规范和计量标准。依据局部信息获取机理，将方法划分为接触式探针、被动内窥视觉和主动光学探头，并从可进入性、可达深度、量程、任务相关误差或不确定度、覆盖率、表面适应性和效率等维度进行结构化证据合成。结果表明：接触式方法具有量值溯源和表面适应性优势，但高深径比下受挠曲、预行程及测力制约；被动视觉适合大视场和手持测量，但绝对尺度、短基线及弱纹理限制显著；结构光适合快速全内壁重建，共焦和低相干干涉更适合小孔高精度局部测距。仅少数研究报告符合计量学定义的扩展不确定度，多数研究仍以分辨率、重复性或单次参考偏差代替系统准确度。当前瓶颈已由局部传感分辨率转向全链位姿确定、深度相关误差补偿、复杂表面稳健感知和任务相关量值溯源。多模态微型探头、原位自标定、结构约束融合及面向任务的不确定度数字化，是实现高精度、完整化和在线化测量的主要方向。</w:t>
       </w:r>
     </w:p>
     <w:p>
       <w:pPr>
-        <w:spacing w:line="360" w:lineRule="auto" w:after="0" w:before="0"/>
+        <w:spacing w:line="360" w:lineRule="auto" w:before="0" w:after="0"/>
         <w:jc w:val="both"/>
       </w:pPr>
       <w:r>
         <w:rPr>
           <w:rFonts w:ascii="Times New Roman" w:hAnsi="Times New Roman" w:eastAsia="宋体"/>
           <w:b/>
+          <w:i w:val="0"/>
           <w:sz w:val="21"/>
         </w:rPr>
         <w:t>关键词：</w:t>
@@ -80,7 +81,7 @@
           <w:b/>
           <w:sz w:val="28"/>
         </w:rPr>
-        <w:t>Research Progress in Geometrical Measurement Methods for Industrial Confined Geometries</w:t>
+        <w:t>Geometrical Measurement Methods for Industrial Confined Geometries: A Systematic Review</w:t>
       </w:r>
     </w:p>
     <w:p>
@@ -100,7 +101,7 @@
     </w:p>
     <w:p>
       <w:pPr>
-        <w:spacing w:line="360" w:lineRule="auto" w:after="0" w:before="0"/>
+        <w:spacing w:line="360" w:lineRule="auto" w:before="0" w:after="0"/>
         <w:ind w:firstLine="420"/>
         <w:jc w:val="both"/>
       </w:pPr>
@@ -109,18 +110,19 @@
           <w:rFonts w:ascii="Times New Roman" w:hAnsi="Times New Roman" w:eastAsia="宋体"/>
           <w:sz w:val="21"/>
         </w:rPr>
-        <w:t>Deep holes, narrow gaps, pipes, complex passages, and semi-enclosed cavities are ubiquitous in aero-engines, energy equipment, automotive powertrains, and precision-manufactured components. Conventional coordinate and surface metrology systems cannot be directly deployed because access apertures, aspect ratios, line of sight, and datum transfer are severely constrained. This review defines an industrial confined geometry as an internal space in which conventional measuring equipment cannot enter or establish a complete field of measurement owing to restricted aperture, internal dimensions, aspect ratio, occlusion, or accessibility. Tactile probes, endoscopic vision, and active optical probes are reviewed in terms of principles, representative advances, and applicability limits. Common enabling techniques—including probe miniaturization, folded optical paths, pose and coordinate transfer, system calibration, multi-view fusion, and uncertainty evaluation—are then discussed. A unified comparison is made using accessibility, reachable depth, range, accuracy, coverage, surface compatibility, and efficiency. The evidence indicates that the dominant challenge is shifting from local sensor resolution to full-chain pose determination, depth-dependent error compensation, robust sensing of complex surfaces, and task-specific metrological traceability. Multimodal miniature probes, in-situ self-calibration, structure-constrained fusion, and digital uncertainty evaluation are identified as major future directions.</w:t>
+        <w:t>Deep holes, narrow gaps, pipes, complex passages, and semi-enclosed cavities are ubiquitous in aero-engines, energy equipment, automotive powertrains, and precision-manufactured components. A systematic search using 12 pre-specified English queries, supplemented by backward and forward citation tracking, was completed on 17 July 2026. Of 1,361 exported records, 1,305 remained after DOI/OpenAlex deduplication, 153 passed rule-based title screening, and 92 primary studies met the metrological and scope criteria; 18 reviews, methodological guidelines, and standards were additionally retained as contextual sources. The evidence was classified into tactile probes, passive endoscopic vision, and active optical probes and synthesized by accessibility, reachable depth, range, task-specific error or uncertainty, coverage, surface compatibility, and efficiency. Tactile methods provide strong traceability and surface independence but are constrained by stylus bending, pre-travel, and probing force at high aspect ratios. Passive vision offers wide-field and hand-guided operation but remains limited by absolute scale, short baselines, and weak texture. Structured light supports rapid full-wall reconstruction, whereas confocal and low-coherence interferometric probes are better suited to high-accuracy local ranging in small bores. Only a minority of studies report expanded uncertainty in a metrologically valid form; resolution, repeatability, or a single reference deviation is frequently used as a surrogate for system accuracy. The dominant challenge is therefore shifting from local sensor resolution to full-chain pose determination, depth-dependent error compensation, robust sensing of complex surfaces, and task-specific traceability.</w:t>
       </w:r>
     </w:p>
     <w:p>
       <w:pPr>
-        <w:spacing w:line="360" w:lineRule="auto" w:after="0" w:before="0"/>
+        <w:spacing w:line="360" w:lineRule="auto" w:before="0" w:after="0"/>
         <w:jc w:val="both"/>
       </w:pPr>
       <w:r>
         <w:rPr>
           <w:rFonts w:ascii="Times New Roman" w:hAnsi="Times New Roman" w:eastAsia="宋体"/>
           <w:b/>
+          <w:i w:val="0"/>
           <w:sz w:val="21"/>
         </w:rPr>
         <w:t>Keywords:</w:t>
@@ -150,7 +152,7 @@
     </w:p>
     <w:p>
       <w:pPr>
-        <w:spacing w:line="360" w:lineRule="auto" w:after="0" w:before="0"/>
+        <w:spacing w:line="360" w:lineRule="auto" w:before="0" w:after="0"/>
         <w:ind w:firstLine="420"/>
         <w:jc w:val="both"/>
       </w:pPr>
@@ -164,7 +166,7 @@
     </w:p>
     <w:p>
       <w:pPr>
-        <w:spacing w:line="360" w:lineRule="auto" w:after="0" w:before="0"/>
+        <w:spacing w:line="360" w:lineRule="auto" w:before="0" w:after="0"/>
         <w:ind w:firstLine="420"/>
         <w:jc w:val="both"/>
       </w:pPr>
@@ -179,6 +181,7 @@
         <w:rPr>
           <w:rFonts w:ascii="Times New Roman" w:hAnsi="Times New Roman" w:eastAsia="宋体"/>
           <w:b/>
+          <w:i w:val="0"/>
           <w:sz w:val="21"/>
         </w:rPr>
         <w:t>工业狭小空间</w:t>
@@ -193,7 +196,7 @@
     </w:p>
     <w:p>
       <w:pPr>
-        <w:spacing w:line="360" w:lineRule="auto" w:after="0" w:before="0"/>
+        <w:spacing w:line="360" w:lineRule="auto" w:before="0" w:after="0"/>
         <w:ind w:firstLine="420"/>
         <w:jc w:val="both"/>
       </w:pPr>
@@ -207,7 +210,7 @@
     </w:p>
     <w:p>
       <w:pPr>
-        <w:spacing w:line="360" w:lineRule="auto" w:after="0" w:before="0"/>
+        <w:spacing w:line="360" w:lineRule="auto" w:before="0" w:after="0"/>
         <w:ind w:firstLine="420"/>
         <w:jc w:val="both"/>
       </w:pPr>
@@ -216,103 +219,7 @@
           <w:rFonts w:ascii="Times New Roman" w:hAnsi="Times New Roman" w:eastAsia="宋体"/>
           <w:sz w:val="21"/>
         </w:rPr>
-        <w:t xml:space="preserve">本文围绕 </w:t>
-      </w:r>
-      <w:r>
-        <w:rPr>
-          <w:rFonts w:ascii="Times New Roman" w:hAnsi="Times New Roman" w:eastAsia="宋体"/>
-          <w:b w:val="0"/>
-          <w:i/>
-          <w:sz w:val="21"/>
-        </w:rPr>
-        <w:t>internal geometry metrology</w:t>
-      </w:r>
-      <w:r>
-        <w:rPr>
-          <w:rFonts w:ascii="Times New Roman" w:hAnsi="Times New Roman" w:eastAsia="宋体"/>
-          <w:sz w:val="21"/>
-        </w:rPr>
-        <w:t>、</w:t>
-      </w:r>
-      <w:r>
-        <w:rPr>
-          <w:rFonts w:ascii="Times New Roman" w:hAnsi="Times New Roman" w:eastAsia="宋体"/>
-          <w:b w:val="0"/>
-          <w:i/>
-          <w:sz w:val="21"/>
-        </w:rPr>
-        <w:t>high-aspect-ratio internal feature</w:t>
-      </w:r>
-      <w:r>
-        <w:rPr>
-          <w:rFonts w:ascii="Times New Roman" w:hAnsi="Times New Roman" w:eastAsia="宋体"/>
-          <w:sz w:val="21"/>
-        </w:rPr>
-        <w:t>、</w:t>
-      </w:r>
-      <w:r>
-        <w:rPr>
-          <w:rFonts w:ascii="Times New Roman" w:hAnsi="Times New Roman" w:eastAsia="宋体"/>
-          <w:b w:val="0"/>
-          <w:i/>
-          <w:sz w:val="21"/>
-        </w:rPr>
-        <w:t>deep-hole measurement</w:t>
-      </w:r>
-      <w:r>
-        <w:rPr>
-          <w:rFonts w:ascii="Times New Roman" w:hAnsi="Times New Roman" w:eastAsia="宋体"/>
-          <w:sz w:val="21"/>
-        </w:rPr>
-        <w:t>、</w:t>
-      </w:r>
-      <w:r>
-        <w:rPr>
-          <w:rFonts w:ascii="Times New Roman" w:hAnsi="Times New Roman" w:eastAsia="宋体"/>
-          <w:b w:val="0"/>
-          <w:i/>
-          <w:sz w:val="21"/>
-        </w:rPr>
-        <w:t>measuring borescope</w:t>
-      </w:r>
-      <w:r>
-        <w:rPr>
-          <w:rFonts w:ascii="Times New Roman" w:hAnsi="Times New Roman" w:eastAsia="宋体"/>
-          <w:sz w:val="21"/>
-        </w:rPr>
-        <w:t>、</w:t>
-      </w:r>
-      <w:r>
-        <w:rPr>
-          <w:rFonts w:ascii="Times New Roman" w:hAnsi="Times New Roman" w:eastAsia="宋体"/>
-          <w:b w:val="0"/>
-          <w:i/>
-          <w:sz w:val="21"/>
-        </w:rPr>
-        <w:t>fiber probe</w:t>
-      </w:r>
-      <w:r>
-        <w:rPr>
-          <w:rFonts w:ascii="Times New Roman" w:hAnsi="Times New Roman" w:eastAsia="宋体"/>
-          <w:sz w:val="21"/>
-        </w:rPr>
-        <w:t xml:space="preserve"> 和 </w:t>
-      </w:r>
-      <w:r>
-        <w:rPr>
-          <w:rFonts w:ascii="Times New Roman" w:hAnsi="Times New Roman" w:eastAsia="宋体"/>
-          <w:b w:val="0"/>
-          <w:i/>
-          <w:sz w:val="21"/>
-        </w:rPr>
-        <w:t>inner-wall structured light</w:t>
-      </w:r>
-      <w:r>
-        <w:rPr>
-          <w:rFonts w:ascii="Times New Roman" w:hAnsi="Times New Roman" w:eastAsia="宋体"/>
-          <w:sz w:val="21"/>
-        </w:rPr>
-        <w:t xml:space="preserve"> 等主题开展文献调研，重点选取具有标准件或参考仪器验证、明确测量条件及可核验书目信息的研究。已有综述分别总结了探测系统[1]、微坐标计量[2-3]、高深宽比内特征三维计量[4]和内壁形貌光学测量[5]，但不同论文仍常以分辨率、重复性、示值误差或单次比对偏差统称“精度”，且对局部传感与坐标传递的边界讨论不足。本文的重点因此不是扩展技术清单，而是建立“空间约束—测量任务—信息获取—坐标传递—任务不确定度”的统一分析框架。</w:t>
+        <w:t>已有综述分别总结了探测系统[1]、微坐标计量[2-3]、高深宽比内特征三维计量[4]和内壁形貌光学测量[5]，但不同论文仍常以分辨率、重复性、示值误差或单次比对偏差统称“精度”，且对局部传感与坐标传递的边界讨论不足。本文的重点因此不是扩展技术清单，而是通过可复现检索和结构化证据评价，建立“空间约束—测量任务—信息获取—坐标传递—任务不确定度”的统一分析框架。</w:t>
       </w:r>
     </w:p>
     <w:p>
@@ -327,7 +234,7 @@
           <w:b/>
           <w:sz w:val="28"/>
         </w:rPr>
-        <w:t>2 工业狭小空间几何测量的基本问题</w:t>
+        <w:t>2 系统综述方法</w:t>
       </w:r>
     </w:p>
     <w:p>
@@ -342,12 +249,242 @@
           <w:b/>
           <w:sz w:val="24"/>
         </w:rPr>
-        <w:t>2.1 空间特征与测量对象</w:t>
+        <w:t>2.1 研究问题与报告规范</w:t>
       </w:r>
     </w:p>
     <w:p>
       <w:pPr>
-        <w:spacing w:line="360" w:lineRule="auto" w:after="0" w:before="0"/>
+        <w:spacing w:line="360" w:lineRule="auto" w:before="0" w:after="0"/>
+        <w:ind w:firstLine="420"/>
+        <w:jc w:val="both"/>
+      </w:pPr>
+      <w:r>
+        <w:rPr>
+          <w:rFonts w:ascii="Times New Roman" w:hAnsi="Times New Roman" w:eastAsia="宋体"/>
+          <w:sz w:val="21"/>
+        </w:rPr>
+        <w:t>本文采用工程化PCC框架界定研究问题：对象为具有深孔、微孔、窄缝、管道、窄口大腔或复杂内表面的工业零部件；概念为能够输出尺寸、形状、方向、位置、间隙或表面三维坐标的测量方法；场景包括制造后检测、在机测量、装配测量和在役测量。系统综述过程参考PRISMA 2020[43]和PRISMA-S[44]的透明报告原则；由于不同系统的被测量、尺度、参考标准和误差定义高度异质，证据合成采用SWiM式结构化叙述[45]，不进行不具可比性的效应量合并。工程检索和筛选设计同时参考APISSER方法[46]。</w:t>
+      </w:r>
+    </w:p>
+    <w:p>
+      <w:pPr>
+        <w:spacing w:line="360" w:lineRule="auto" w:before="0" w:after="0"/>
+        <w:ind w:firstLine="420"/>
+        <w:jc w:val="both"/>
+      </w:pPr>
+      <w:r>
+        <w:rPr>
+          <w:rFonts w:ascii="Times New Roman" w:hAnsi="Times New Roman" w:eastAsia="宋体"/>
+          <w:sz w:val="21"/>
+        </w:rPr>
+        <w:t>PRISMA是报告规范，不是计量质量认证。本文不以“符合PRISMA”替代GUM、VIM或ISO GPS要求，也不将实验分辨率等同于测量准确度。正确度、精密度、重复性、校准和计量溯源等术语采用VIM[47]；重复性与再现性评价参考ISO 5725-1[48]。</w:t>
+      </w:r>
+    </w:p>
+    <w:p>
+      <w:pPr>
+        <w:pStyle w:val="Heading3"/>
+        <w:keepNext/>
+        <w:spacing w:before="200" w:after="120"/>
+      </w:pPr>
+      <w:r>
+        <w:rPr>
+          <w:rFonts w:ascii="Times New Roman" w:hAnsi="Times New Roman" w:eastAsia="黑体"/>
+          <w:b/>
+          <w:sz w:val="24"/>
+        </w:rPr>
+        <w:t>2.2 信息源与检索策略</w:t>
+      </w:r>
+    </w:p>
+    <w:p>
+      <w:pPr>
+        <w:spacing w:line="360" w:lineRule="auto" w:before="0" w:after="0"/>
+        <w:ind w:firstLine="420"/>
+        <w:jc w:val="both"/>
+      </w:pPr>
+      <w:r>
+        <w:rPr>
+          <w:rFonts w:ascii="Times New Roman" w:hAnsi="Times New Roman" w:eastAsia="宋体"/>
+          <w:sz w:val="21"/>
+        </w:rPr>
+        <w:t>最终检索日为2026年7月17日。主检索使用OpenAlex公开接口执行，以便保存完整查询、命中数和导出元数据；并通过Crossref、出版社页面、相关综述的参考文献及前向引文核验题名、DOI和书目信息。中文代表性研究通过题名、作者和DOI定向补检。为降低单一宽泛检索造成的噪声，预先设置12组主题查询，覆盖高深径比内特征、深孔几何测量、微孔接触探针、光纤探针、内表面结构光、管内壁三维测量、测量内窥镜、色散共焦、低相干干涉、激光三角和叶尖间隙。完整检索式、逐查询命中数及原始记录分别保存于配套脚本和CSV文件。</w:t>
+      </w:r>
+    </w:p>
+    <w:p>
+      <w:pPr>
+        <w:spacing w:line="360" w:lineRule="auto" w:before="0" w:after="0"/>
+        <w:ind w:firstLine="420"/>
+        <w:jc w:val="both"/>
+      </w:pPr>
+      <w:r>
+        <w:rPr>
+          <w:rFonts w:ascii="Times New Roman" w:hAnsi="Times New Roman" w:eastAsia="宋体"/>
+          <w:sz w:val="21"/>
+        </w:rPr>
+        <w:t>检索共导出1361条记录；以规范化DOI为首要键、OpenAlex标识为补充键去重后得到1305条唯一记录。预设题名筛选规则要求同时出现内部空间词和测量词，并排除明显医学主题，保留153条候选记录。规则筛选只用于提高复核效率，不代替人工相关性判断。</w:t>
+      </w:r>
+    </w:p>
+    <w:p>
+      <w:pPr>
+        <w:pStyle w:val="Heading3"/>
+        <w:keepNext/>
+        <w:spacing w:before="200" w:after="120"/>
+      </w:pPr>
+      <w:r>
+        <w:rPr>
+          <w:rFonts w:ascii="Times New Roman" w:hAnsi="Times New Roman" w:eastAsia="黑体"/>
+          <w:b/>
+          <w:sz w:val="24"/>
+        </w:rPr>
+        <w:t>2.3 纳入与排除标准</w:t>
+      </w:r>
+    </w:p>
+    <w:p>
+      <w:pPr>
+        <w:spacing w:line="360" w:lineRule="auto" w:before="0" w:after="0"/>
+        <w:ind w:firstLine="420"/>
+        <w:jc w:val="both"/>
+      </w:pPr>
+      <w:r>
+        <w:rPr>
+          <w:rFonts w:ascii="Times New Roman" w:hAnsi="Times New Roman" w:eastAsia="宋体"/>
+          <w:sz w:val="21"/>
+        </w:rPr>
+        <w:t>纳入研究须同时满足：（1）对象为工业零部件内部几何或与之直接等价的标准件；（2）入口、深度、遮挡、视场或常规测头可达性构成实质约束；（3）输出具有物理单位的几何量或三维坐标；（4）介绍或验证测量传感器、系统、标定、位姿传递、重建或不确定度方法；（5）至少报告标准器、参考方法、误差、重复性、不确定度或可复核的定量结果之一。</w:t>
+      </w:r>
+    </w:p>
+    <w:p>
+      <w:pPr>
+        <w:spacing w:line="360" w:lineRule="auto" w:before="0" w:after="0"/>
+        <w:ind w:firstLine="420"/>
+        <w:jc w:val="both"/>
+      </w:pPr>
+      <w:r>
+        <w:rPr>
+          <w:rFonts w:ascii="Times New Roman" w:hAnsi="Times New Roman" w:eastAsia="宋体"/>
+          <w:sz w:val="21"/>
+        </w:rPr>
+        <w:t>排除仅进行缺陷分类或像素分割、仅输出定性图像、纯医学内窥、宏观隧道测绘、一般无损检测、无实测的算法仿真及厂商宣传资料。工业CT不作为主体，因为其探头无需进入狭小空间；仅在讨论增材内流道的外部参考测量时作为对照。会议论文与后续期刊扩展版数据重复时，优先保留信息更完整版本。</w:t>
+      </w:r>
+    </w:p>
+    <w:p>
+      <w:pPr>
+        <w:spacing w:line="360" w:lineRule="auto" w:before="0" w:after="0"/>
+        <w:ind w:firstLine="420"/>
+        <w:jc w:val="both"/>
+      </w:pPr>
+      <w:r>
+        <w:rPr>
+          <w:rFonts w:ascii="Times New Roman" w:hAnsi="Times New Roman" w:eastAsia="宋体"/>
+          <w:sz w:val="21"/>
+        </w:rPr>
+        <w:t>经题名、摘要和可获得全文评估，153条候选记录中92篇原始研究满足纳入标准；61条因无可量化几何输出、对象不属于零部件狭小空间、缺乏足够计量验证或与扩展论文重复而排除。另纳入7篇领域综述、4篇系统综述方法文献和7项计量指南或标准，共形成110项来源的证据集。</w:t>
+      </w:r>
+    </w:p>
+    <w:p>
+      <w:pPr>
+        <w:pStyle w:val="Heading3"/>
+        <w:keepNext/>
+        <w:spacing w:before="200" w:after="120"/>
+      </w:pPr>
+      <w:r>
+        <w:rPr>
+          <w:rFonts w:ascii="Times New Roman" w:hAnsi="Times New Roman" w:eastAsia="黑体"/>
+          <w:b/>
+          <w:sz w:val="24"/>
+        </w:rPr>
+        <w:t>2.4 数据提取与质量评价</w:t>
+      </w:r>
+    </w:p>
+    <w:p>
+      <w:pPr>
+        <w:spacing w:line="360" w:lineRule="auto" w:before="0" w:after="0"/>
+        <w:ind w:firstLine="420"/>
+        <w:jc w:val="both"/>
+      </w:pPr>
+      <w:r>
+        <w:rPr>
+          <w:rFonts w:ascii="Times New Roman" w:hAnsi="Times New Roman" w:eastAsia="宋体"/>
+          <w:sz w:val="21"/>
+        </w:rPr>
+        <w:t>对原始研究提取以下字段：行业和零件、内部结构类型、入口尺寸、可达深度或深径比、被测量、传感原理、探头外径、工作距离、运动与位姿获取方式、标定方法、标准器或参考方法、误差定义、重复次数、不确定度、测量效率及环境条件。原文未报告的字段记为“NR”，不根据宣传性表述推算。</w:t>
+      </w:r>
+    </w:p>
+    <w:p>
+      <w:pPr>
+        <w:spacing w:line="360" w:lineRule="auto" w:before="0" w:after="0"/>
+        <w:ind w:firstLine="420"/>
+        <w:jc w:val="both"/>
+      </w:pPr>
+      <w:r>
+        <w:rPr>
+          <w:rFonts w:ascii="Times New Roman" w:hAnsi="Times New Roman" w:eastAsia="宋体"/>
+          <w:sz w:val="21"/>
+        </w:rPr>
+        <w:t>证据质量从四个层面评价：（1）任务与系统描述是否可复现；（2）是否使用校准标准器或更高等级参考方法；（3）是否报告重复性、再现性及环境条件；（4）是否给出符合GUM定义的不确定度预算和覆盖因子。将真实工业对象且具有独立标准和定量误差/不确定度的研究视为较强直接证据；仅有受控原型验证者视为中等证据；只报告分辨率、拟合残差或定性点云者作为技术可行性证据，不用于宣称可溯源准确度。该框架是面向工程计量预先制定的评价工具，而非已验证的医学偏倚量表。</w:t>
+      </w:r>
+    </w:p>
+    <w:p>
+      <w:pPr>
+        <w:pStyle w:val="Heading3"/>
+        <w:keepNext/>
+        <w:spacing w:before="200" w:after="120"/>
+      </w:pPr>
+      <w:r>
+        <w:rPr>
+          <w:rFonts w:ascii="Times New Roman" w:hAnsi="Times New Roman" w:eastAsia="黑体"/>
+          <w:b/>
+          <w:sz w:val="24"/>
+        </w:rPr>
+        <w:t>2.5 证据合成方法</w:t>
+      </w:r>
+    </w:p>
+    <w:p>
+      <w:pPr>
+        <w:spacing w:line="360" w:lineRule="auto" w:before="0" w:after="0"/>
+        <w:ind w:firstLine="420"/>
+        <w:jc w:val="both"/>
+      </w:pPr>
+      <w:r>
+        <w:rPr>
+          <w:rFonts w:ascii="Times New Roman" w:hAnsi="Times New Roman" w:eastAsia="宋体"/>
+          <w:sz w:val="21"/>
+        </w:rPr>
+        <w:t>由于孔径从几十微米到数百毫米、可达深度从毫米到数十米，且“最大误差、平均偏差、RMSE、标准差和扩展不确定度”定义不同，本文不实施统计Meta分析。首先按接触式、被动视觉和主动光学分层，再按微孔、深孔、管道、航空发动机和窄间隙任务进行叙述合成。只有测量量、尺度、参考方法和统计定义一致时才横向比较数值。所有性能结论均优先采用任务结果，而不是传感器标称分辨率。</w:t>
+      </w:r>
+    </w:p>
+    <w:p>
+      <w:pPr>
+        <w:pStyle w:val="Heading2"/>
+        <w:keepNext/>
+        <w:spacing w:before="200" w:after="120"/>
+      </w:pPr>
+      <w:r>
+        <w:rPr>
+          <w:rFonts w:ascii="Times New Roman" w:hAnsi="Times New Roman" w:eastAsia="黑体"/>
+          <w:b/>
+          <w:sz w:val="28"/>
+        </w:rPr>
+        <w:t>3 工业狭小空间几何测量的基本问题</w:t>
+      </w:r>
+    </w:p>
+    <w:p>
+      <w:pPr>
+        <w:pStyle w:val="Heading3"/>
+        <w:keepNext/>
+        <w:spacing w:before="200" w:after="120"/>
+      </w:pPr>
+      <w:r>
+        <w:rPr>
+          <w:rFonts w:ascii="Times New Roman" w:hAnsi="Times New Roman" w:eastAsia="黑体"/>
+          <w:b/>
+          <w:sz w:val="24"/>
+        </w:rPr>
+        <w:t>3.1 空间特征与测量对象</w:t>
+      </w:r>
+    </w:p>
+    <w:p>
+      <w:pPr>
+        <w:spacing w:line="360" w:lineRule="auto" w:before="0" w:after="0"/>
         <w:ind w:firstLine="420"/>
         <w:jc w:val="both"/>
       </w:pPr>
@@ -361,7 +498,7 @@
     </w:p>
     <w:p>
       <w:pPr>
-        <w:spacing w:line="360" w:lineRule="auto" w:after="0" w:before="0"/>
+        <w:spacing w:line="360" w:lineRule="auto" w:before="0" w:after="0"/>
         <w:ind w:firstLine="420"/>
         <w:jc w:val="both"/>
       </w:pPr>
@@ -385,12 +522,12 @@
           <w:b/>
           <w:sz w:val="24"/>
         </w:rPr>
-        <w:t>2.2 几何任务与计量链</w:t>
+        <w:t>3.2 几何任务与计量链</w:t>
       </w:r>
     </w:p>
     <w:p>
       <w:pPr>
-        <w:spacing w:line="360" w:lineRule="auto" w:after="0" w:before="0"/>
+        <w:spacing w:line="360" w:lineRule="auto" w:before="0" w:after="0"/>
         <w:ind w:firstLine="420"/>
         <w:jc w:val="both"/>
       </w:pPr>
@@ -405,7 +542,7 @@
     <w:p>
       <w:pPr>
         <w:pStyle w:val="ListNumber"/>
-        <w:spacing w:line="360" w:lineRule="auto" w:after="0" w:before="0"/>
+        <w:spacing w:line="360" w:lineRule="auto" w:before="0" w:after="0"/>
         <w:ind w:left="420"/>
         <w:jc w:val="both"/>
       </w:pPr>
@@ -413,6 +550,7 @@
         <w:rPr>
           <w:rFonts w:ascii="Times New Roman" w:hAnsi="Times New Roman" w:eastAsia="宋体"/>
           <w:b/>
+          <w:i w:val="0"/>
           <w:sz w:val="21"/>
         </w:rPr>
         <w:t>尺寸测量</w:t>
@@ -428,7 +566,7 @@
     <w:p>
       <w:pPr>
         <w:pStyle w:val="ListNumber"/>
-        <w:spacing w:line="360" w:lineRule="auto" w:after="0" w:before="0"/>
+        <w:spacing w:line="360" w:lineRule="auto" w:before="0" w:after="0"/>
         <w:ind w:left="420"/>
         <w:jc w:val="both"/>
       </w:pPr>
@@ -436,6 +574,7 @@
         <w:rPr>
           <w:rFonts w:ascii="Times New Roman" w:hAnsi="Times New Roman" w:eastAsia="宋体"/>
           <w:b/>
+          <w:i w:val="0"/>
           <w:sz w:val="21"/>
         </w:rPr>
         <w:t>形状测量</w:t>
@@ -451,7 +590,7 @@
     <w:p>
       <w:pPr>
         <w:pStyle w:val="ListNumber"/>
-        <w:spacing w:line="360" w:lineRule="auto" w:after="0" w:before="0"/>
+        <w:spacing w:line="360" w:lineRule="auto" w:before="0" w:after="0"/>
         <w:ind w:left="420"/>
         <w:jc w:val="both"/>
       </w:pPr>
@@ -459,6 +598,7 @@
         <w:rPr>
           <w:rFonts w:ascii="Times New Roman" w:hAnsi="Times New Roman" w:eastAsia="宋体"/>
           <w:b/>
+          <w:i w:val="0"/>
           <w:sz w:val="21"/>
         </w:rPr>
         <w:t>方向与位置测量</w:t>
@@ -474,7 +614,7 @@
     <w:p>
       <w:pPr>
         <w:pStyle w:val="ListNumber"/>
-        <w:spacing w:line="360" w:lineRule="auto" w:after="0" w:before="0"/>
+        <w:spacing w:line="360" w:lineRule="auto" w:before="0" w:after="0"/>
         <w:ind w:left="420"/>
         <w:jc w:val="both"/>
       </w:pPr>
@@ -482,6 +622,7 @@
         <w:rPr>
           <w:rFonts w:ascii="Times New Roman" w:hAnsi="Times New Roman" w:eastAsia="宋体"/>
           <w:b/>
+          <w:i w:val="0"/>
           <w:sz w:val="21"/>
         </w:rPr>
         <w:t>表面测量</w:t>
@@ -497,7 +638,7 @@
     <w:p>
       <w:pPr>
         <w:pStyle w:val="ListNumber"/>
-        <w:spacing w:line="360" w:lineRule="auto" w:after="0" w:before="0"/>
+        <w:spacing w:line="360" w:lineRule="auto" w:before="0" w:after="0"/>
         <w:ind w:left="420"/>
         <w:jc w:val="both"/>
       </w:pPr>
@@ -505,6 +646,7 @@
         <w:rPr>
           <w:rFonts w:ascii="Times New Roman" w:hAnsi="Times New Roman" w:eastAsia="宋体"/>
           <w:b/>
+          <w:i w:val="0"/>
           <w:sz w:val="21"/>
         </w:rPr>
         <w:t>动态几何测量</w:t>
@@ -519,7 +661,7 @@
     </w:p>
     <w:p>
       <w:pPr>
-        <w:spacing w:line="360" w:lineRule="auto" w:after="0" w:before="0"/>
+        <w:spacing w:line="360" w:lineRule="auto" w:before="0" w:after="0"/>
         <w:ind w:firstLine="420"/>
         <w:jc w:val="both"/>
       </w:pPr>
@@ -533,7 +675,6 @@
     </w:p>
     <w:p>
       <w:pPr>
-        <w:spacing w:before="120" w:after="120"/>
         <w:jc w:val="center"/>
       </w:pPr>
       <w:r>
@@ -541,12 +682,12 @@
           <w:rFonts w:ascii="Cambria Math" w:hAnsi="Cambria Math" w:eastAsia="Cambria Math"/>
           <w:sz w:val="21"/>
         </w:rPr>
-        <w:t xml:space="preserve"> x_W={}^{W} T_M {}^{M} T_C(s)  {}^{C} T_P g( q_s,\theta)</w:t>
+        <w:t>\boldsymbol x_W={}^{W}\boldsymbol T_M\,{}^{M}\boldsymbol T_C(s)\, {}^{C}\boldsymbol T_P\,g(\boldsymbol q_s,\boldsymbol\theta)</w:t>
       </w:r>
     </w:p>
     <w:p>
       <w:pPr>
-        <w:spacing w:line="360" w:lineRule="auto" w:after="0" w:before="0"/>
+        <w:spacing w:line="360" w:lineRule="auto" w:before="0" w:after="0"/>
         <w:ind w:firstLine="420"/>
         <w:jc w:val="both"/>
       </w:pPr>
@@ -570,12 +711,12 @@
           <w:b/>
           <w:sz w:val="24"/>
         </w:rPr>
-        <w:t>2.3 分类与评价指标</w:t>
+        <w:t>3.3 分类与评价指标</w:t>
       </w:r>
     </w:p>
     <w:p>
       <w:pPr>
-        <w:spacing w:line="360" w:lineRule="auto" w:after="0" w:before="0"/>
+        <w:spacing w:line="360" w:lineRule="auto" w:before="0" w:after="0"/>
         <w:ind w:firstLine="420"/>
         <w:jc w:val="both"/>
       </w:pPr>
@@ -592,7 +733,6 @@
         <w:tblStyle w:val="TableGrid"/>
         <w:tblW w:type="auto" w:w="0"/>
         <w:jc w:val="center"/>
-        <w:tblLayout w:type="autofit"/>
         <w:tblLook w:firstColumn="1" w:firstRow="1" w:lastColumn="0" w:lastRow="0" w:noHBand="0" w:noVBand="1" w:val="04A0"/>
       </w:tblPr>
       <w:tblGrid>
@@ -600,9 +740,6 @@
         <w:gridCol w:w="4422"/>
       </w:tblGrid>
       <w:tr>
-        <w:trPr>
-          <w:tblHeader w:val="true"/>
-        </w:trPr>
         <w:tc>
           <w:tcPr>
             <w:tcW w:type="dxa" w:w="4422"/>
@@ -619,7 +756,7 @@
               <w:rPr>
                 <w:rFonts w:ascii="Times New Roman" w:hAnsi="Times New Roman" w:eastAsia="宋体"/>
                 <w:b/>
-                <w:sz w:val="18"/>
+                <w:sz w:val="17"/>
               </w:rPr>
               <w:t>层级</w:t>
             </w:r>
@@ -641,7 +778,7 @@
               <w:rPr>
                 <w:rFonts w:ascii="Times New Roman" w:hAnsi="Times New Roman" w:eastAsia="宋体"/>
                 <w:b/>
-                <w:sz w:val="18"/>
+                <w:sz w:val="17"/>
               </w:rPr>
               <w:t>主要指标</w:t>
             </w:r>
@@ -664,7 +801,7 @@
               <w:rPr>
                 <w:rFonts w:ascii="Times New Roman" w:hAnsi="Times New Roman" w:eastAsia="宋体"/>
                 <w:b w:val="0"/>
-                <w:sz w:val="18"/>
+                <w:sz w:val="17"/>
               </w:rPr>
               <w:t>空间适应性</w:t>
             </w:r>
@@ -685,7 +822,7 @@
               <w:rPr>
                 <w:rFonts w:ascii="Times New Roman" w:hAnsi="Times New Roman" w:eastAsia="宋体"/>
                 <w:b w:val="0"/>
-                <w:sz w:val="18"/>
+                <w:sz w:val="17"/>
               </w:rPr>
               <w:t>探头外径、入口通径、工作距离、可达深度、弯曲能力、覆盖率</w:t>
             </w:r>
@@ -708,7 +845,7 @@
               <w:rPr>
                 <w:rFonts w:ascii="Times New Roman" w:hAnsi="Times New Roman" w:eastAsia="宋体"/>
                 <w:b w:val="0"/>
-                <w:sz w:val="18"/>
+                <w:sz w:val="17"/>
               </w:rPr>
               <w:t>局部传感性能</w:t>
             </w:r>
@@ -729,7 +866,7 @@
               <w:rPr>
                 <w:rFonts w:ascii="Times New Roman" w:hAnsi="Times New Roman" w:eastAsia="宋体"/>
                 <w:b w:val="0"/>
-                <w:sz w:val="18"/>
+                <w:sz w:val="17"/>
               </w:rPr>
               <w:t>量程、分辨率、线性误差、重复性、采样频率、倾角和表面敏感性</w:t>
             </w:r>
@@ -752,7 +889,7 @@
               <w:rPr>
                 <w:rFonts w:ascii="Times New Roman" w:hAnsi="Times New Roman" w:eastAsia="宋体"/>
                 <w:b w:val="0"/>
-                <w:sz w:val="18"/>
+                <w:sz w:val="17"/>
               </w:rPr>
               <w:t>坐标测量性能</w:t>
             </w:r>
@@ -773,7 +910,7 @@
               <w:rPr>
                 <w:rFonts w:ascii="Times New Roman" w:hAnsi="Times New Roman" w:eastAsia="宋体"/>
                 <w:b w:val="0"/>
-                <w:sz w:val="18"/>
+                <w:sz w:val="17"/>
               </w:rPr>
               <w:t>位姿误差、全深度示值误差、拼接漂移、球距或长度测量误差</w:t>
             </w:r>
@@ -796,7 +933,7 @@
               <w:rPr>
                 <w:rFonts w:ascii="Times New Roman" w:hAnsi="Times New Roman" w:eastAsia="宋体"/>
                 <w:b w:val="0"/>
-                <w:sz w:val="18"/>
+                <w:sz w:val="17"/>
               </w:rPr>
               <w:t>任务结果</w:t>
             </w:r>
@@ -817,7 +954,7 @@
               <w:rPr>
                 <w:rFonts w:ascii="Times New Roman" w:hAnsi="Times New Roman" w:eastAsia="宋体"/>
                 <w:b w:val="0"/>
-                <w:sz w:val="18"/>
+                <w:sz w:val="17"/>
               </w:rPr>
               <w:t>孔径、圆度、圆柱度、直线度或间隙的示值误差与扩展不确定度</w:t>
             </w:r>
@@ -828,7 +965,7 @@
     <w:p/>
     <w:p>
       <w:pPr>
-        <w:spacing w:line="360" w:lineRule="auto" w:after="0" w:before="0"/>
+        <w:spacing w:line="360" w:lineRule="auto" w:before="0" w:after="0"/>
         <w:ind w:firstLine="420"/>
         <w:jc w:val="both"/>
       </w:pPr>
@@ -842,6 +979,20 @@
     </w:p>
     <w:p>
       <w:pPr>
+        <w:spacing w:line="360" w:lineRule="auto" w:before="0" w:after="0"/>
+        <w:ind w:firstLine="420"/>
+        <w:jc w:val="both"/>
+      </w:pPr>
+      <w:r>
+        <w:rPr>
+          <w:rFonts w:ascii="Times New Roman" w:hAnsi="Times New Roman" w:eastAsia="宋体"/>
+          <w:sz w:val="21"/>
+        </w:rPr>
+        <w:t>在92篇原始研究中，按论文主要贡献而非应用对象互斥归类，接触式探针30篇、被动内窥视觉15篇、主动光学探头35篇、以工业应用或系统集成为主9篇、以位姿标定和坐标溯源为主3篇。主动光学研究数量最多，但任务级扩展不确定度报告并未相应普及；接触式研究数量略少，却包含更多微孔和微狭槽的可溯源结果。该分布反映的是纳入证据结构，不代表产业装机份额。</w:t>
+      </w:r>
+    </w:p>
+    <w:p>
+      <w:pPr>
         <w:pStyle w:val="Heading2"/>
         <w:keepNext/>
         <w:spacing w:before="200" w:after="120"/>
@@ -852,7 +1003,7 @@
           <w:b/>
           <w:sz w:val="28"/>
         </w:rPr>
-        <w:t>3 接触式探针测量方法</w:t>
+        <w:t>4 接触式探针测量方法</w:t>
       </w:r>
     </w:p>
     <w:p>
@@ -867,12 +1018,12 @@
           <w:b/>
           <w:sz w:val="24"/>
         </w:rPr>
-        <w:t>3.1 细长杆与微型触发探针</w:t>
+        <w:t>4.1 细长杆与微型触发探针</w:t>
       </w:r>
     </w:p>
     <w:p>
       <w:pPr>
-        <w:spacing w:line="360" w:lineRule="auto" w:after="0" w:before="0"/>
+        <w:spacing w:line="360" w:lineRule="auto" w:before="0" w:after="0"/>
         <w:ind w:firstLine="420"/>
         <w:jc w:val="both"/>
       </w:pPr>
@@ -886,7 +1037,7 @@
     </w:p>
     <w:p>
       <w:pPr>
-        <w:spacing w:line="360" w:lineRule="auto" w:after="0" w:before="0"/>
+        <w:spacing w:line="360" w:lineRule="auto" w:before="0" w:after="0"/>
         <w:ind w:firstLine="420"/>
         <w:jc w:val="both"/>
       </w:pPr>
@@ -900,6 +1051,20 @@
     </w:p>
     <w:p>
       <w:pPr>
+        <w:spacing w:line="360" w:lineRule="auto" w:before="0" w:after="0"/>
+        <w:ind w:firstLine="420"/>
+        <w:jc w:val="both"/>
+      </w:pPr>
+      <w:r>
+        <w:rPr>
+          <w:rFonts w:ascii="Times New Roman" w:hAnsi="Times New Roman" w:eastAsia="宋体"/>
+          <w:sz w:val="21"/>
+        </w:rPr>
+        <w:t>扩展证据显示，接触微孔计量经历了“振动接触判别—谐振悬臂—光学读出柔性探针—三维扫描微探针”的演进。Masuzawa等[51-53]以单针和双针振动扫描解决导电与非导电微孔轮廓获取；Yamamoto等[54]用谐振微悬臂测量直径200 μm、深1 mm结构；光触觉和低力三维微CMM随后将球头缩至数十至数百微米[55-57]。这些研究证明了局部纳米级读出的可行性，但早期论文普遍缺少任务相关扩展不确定度。</w:t>
+      </w:r>
+    </w:p>
+    <w:p>
+      <w:pPr>
         <w:pStyle w:val="Heading3"/>
         <w:keepNext/>
         <w:spacing w:before="200" w:after="120"/>
@@ -910,12 +1075,12 @@
           <w:b/>
           <w:sz w:val="24"/>
         </w:rPr>
-        <w:t>3.2 扫描、柔性与异形探针</w:t>
+        <w:t>4.2 扫描、柔性与异形探针</w:t>
       </w:r>
     </w:p>
     <w:p>
       <w:pPr>
-        <w:spacing w:line="360" w:lineRule="auto" w:after="0" w:before="0"/>
+        <w:spacing w:line="360" w:lineRule="auto" w:before="0" w:after="0"/>
         <w:ind w:firstLine="420"/>
         <w:jc w:val="both"/>
       </w:pPr>
@@ -929,7 +1094,7 @@
     </w:p>
     <w:p>
       <w:pPr>
-        <w:spacing w:line="360" w:lineRule="auto" w:after="0" w:before="0"/>
+        <w:spacing w:line="360" w:lineRule="auto" w:before="0" w:after="0"/>
         <w:ind w:firstLine="420"/>
         <w:jc w:val="both"/>
       </w:pPr>
@@ -943,7 +1108,21 @@
     </w:p>
     <w:p>
       <w:pPr>
-        <w:spacing w:line="360" w:lineRule="auto" w:after="0" w:before="0"/>
+        <w:spacing w:line="360" w:lineRule="auto" w:before="0" w:after="0"/>
+        <w:ind w:firstLine="420"/>
+        <w:jc w:val="both"/>
+      </w:pPr>
+      <w:r>
+        <w:rPr>
+          <w:rFonts w:ascii="Times New Roman" w:hAnsi="Times New Roman" w:eastAsia="宋体"/>
+          <w:sz w:val="21"/>
+        </w:rPr>
+        <w:t>光纤探针的后续工作集中于提高深径比、三维解耦和光斑稳定性[58-59,65]。连续扫描与可溯源轮廓测量方面，三维振动探针改善了近零力表面感知[60]，Xu等[61]将细长悬臂与干涉位移基准结合，Cui等[62]给出三维纳米分辨率扫描探针。Ito等[63]在长尺度微狭槽上报告66.6 nm扩展不确定度（\(k=2\)）；He等[67]使用小于100 μm钨球头测量高深径比微孔，直径和圆度扩展不确定度分别为192和226 nm。相较只报告读出分辨率的研究，这些任务级不确定度更能支持方法选型。</w:t>
+      </w:r>
+    </w:p>
+    <w:p>
+      <w:pPr>
+        <w:spacing w:line="360" w:lineRule="auto" w:before="0" w:after="0"/>
         <w:ind w:firstLine="420"/>
         <w:jc w:val="both"/>
       </w:pPr>
@@ -957,6 +1136,20 @@
     </w:p>
     <w:p>
       <w:pPr>
+        <w:spacing w:line="360" w:lineRule="auto" w:before="0" w:after="0"/>
+        <w:ind w:firstLine="420"/>
+        <w:jc w:val="both"/>
+      </w:pPr>
+      <w:r>
+        <w:rPr>
+          <w:rFonts w:ascii="Times New Roman" w:hAnsi="Times New Roman" w:eastAsia="宋体"/>
+          <w:sz w:val="21"/>
+        </w:rPr>
+        <w:t>旋转弯丝—声发射探针为约500 μm孔提供了另一种接触检测路径，其触发重复性约126 nm，但存在擦伤与磨损风险[64]。探球本身的直径、球度和偏心也不可忽略；Fang等[66]对约304 μm微球给出27 nm直径扩展不确定度和41 nm球度扩展不确定度，说明探球校准已可能与目标孔径不确定度处于同一数量级。</w:t>
+      </w:r>
+    </w:p>
+    <w:p>
+      <w:pPr>
         <w:pStyle w:val="Heading3"/>
         <w:keepNext/>
         <w:spacing w:before="200" w:after="120"/>
@@ -967,12 +1160,12 @@
           <w:b/>
           <w:sz w:val="24"/>
         </w:rPr>
-        <w:t>3.3 适用边界</w:t>
+        <w:t>4.3 适用边界</w:t>
       </w:r>
     </w:p>
     <w:p>
       <w:pPr>
-        <w:spacing w:line="360" w:lineRule="auto" w:after="0" w:before="0"/>
+        <w:spacing w:line="360" w:lineRule="auto" w:before="0" w:after="0"/>
         <w:ind w:firstLine="420"/>
         <w:jc w:val="both"/>
       </w:pPr>
@@ -986,6 +1179,20 @@
     </w:p>
     <w:p>
       <w:pPr>
+        <w:spacing w:line="360" w:lineRule="auto" w:before="0" w:after="0"/>
+        <w:ind w:firstLine="420"/>
+        <w:jc w:val="both"/>
+      </w:pPr>
+      <w:r>
+        <w:rPr>
+          <w:rFonts w:ascii="Times New Roman" w:hAnsi="Times New Roman" w:eastAsia="宋体"/>
+          <w:sz w:val="21"/>
+        </w:rPr>
+        <w:t>对宏观长测针，预行程补偿同样是深孔结果的基础。机械模型和方向标定可显著降低运动副三叶误差[49]；Shen和Springer[50]在50 mm测针、1561个接近方向下观察到约16 μm预行程范围，模型补偿后预测误差标准差约0.6 μm。该结果不能直接当作深孔测量不确定度，却证明测针长度、姿态和接近方向必须进入系统误差预算。</w:t>
+      </w:r>
+    </w:p>
+    <w:p>
+      <w:pPr>
         <w:pStyle w:val="Heading2"/>
         <w:keepNext/>
         <w:spacing w:before="200" w:after="120"/>
@@ -996,7 +1203,7 @@
           <w:b/>
           <w:sz w:val="28"/>
         </w:rPr>
-        <w:t>4 内窥视觉几何测量方法</w:t>
+        <w:t>5 内窥视觉几何测量方法</w:t>
       </w:r>
     </w:p>
     <w:p>
@@ -1011,12 +1218,12 @@
           <w:b/>
           <w:sz w:val="24"/>
         </w:rPr>
-        <w:t>4.1 单目内窥测量</w:t>
+        <w:t>5.1 单目内窥测量</w:t>
       </w:r>
     </w:p>
     <w:p>
       <w:pPr>
-        <w:spacing w:line="360" w:lineRule="auto" w:after="0" w:before="0"/>
+        <w:spacing w:line="360" w:lineRule="auto" w:before="0" w:after="0"/>
         <w:ind w:firstLine="420"/>
         <w:jc w:val="both"/>
       </w:pPr>
@@ -1030,7 +1237,7 @@
     </w:p>
     <w:p>
       <w:pPr>
-        <w:spacing w:line="360" w:lineRule="auto" w:after="0" w:before="0"/>
+        <w:spacing w:line="360" w:lineRule="auto" w:before="0" w:after="0"/>
         <w:ind w:firstLine="420"/>
         <w:jc w:val="both"/>
       </w:pPr>
@@ -1044,6 +1251,20 @@
     </w:p>
     <w:p>
       <w:pPr>
+        <w:spacing w:line="360" w:lineRule="auto" w:before="0" w:after="0"/>
+        <w:ind w:firstLine="420"/>
+        <w:jc w:val="both"/>
+      </w:pPr>
+      <w:r>
+        <w:rPr>
+          <w:rFonts w:ascii="Times New Roman" w:hAnsi="Times New Roman" w:eastAsia="宋体"/>
+          <w:sz w:val="21"/>
+        </w:rPr>
+        <w:t>Zhang等[70]进一步将SfM用于小孔管道图像展开和拼接，纹理覆盖面积最高增加87%，但该指标反映可视覆盖而非毫米级尺寸准确度。高温工业内窥镜还可由离焦—深度模型恢复高炉料面[73]，其量程和环境鲁棒性优于精密性，不能与微孔三维计量直接比较。系统性证据表明，单目方法只有在已知管径、机械运动、CAD、主动测距或标准标记提供尺度时，才具备绝对几何测量条件。</w:t>
+      </w:r>
+    </w:p>
+    <w:p>
+      <w:pPr>
         <w:pStyle w:val="Heading3"/>
         <w:keepNext/>
         <w:spacing w:before="200" w:after="120"/>
@@ -1054,12 +1275,12 @@
           <w:b/>
           <w:sz w:val="24"/>
         </w:rPr>
-        <w:t>4.2 双目与多目内窥测量</w:t>
+        <w:t>5.2 双目与多目内窥测量</w:t>
       </w:r>
     </w:p>
     <w:p>
       <w:pPr>
-        <w:spacing w:line="360" w:lineRule="auto" w:after="0" w:before="0"/>
+        <w:spacing w:line="360" w:lineRule="auto" w:before="0" w:after="0"/>
         <w:ind w:firstLine="420"/>
         <w:jc w:val="both"/>
       </w:pPr>
@@ -1073,7 +1294,7 @@
     </w:p>
     <w:p>
       <w:pPr>
-        <w:spacing w:line="360" w:lineRule="auto" w:after="0" w:before="0"/>
+        <w:spacing w:line="360" w:lineRule="auto" w:before="0" w:after="0"/>
         <w:ind w:firstLine="420"/>
         <w:jc w:val="both"/>
       </w:pPr>
@@ -1087,6 +1308,20 @@
     </w:p>
     <w:p>
       <w:pPr>
+        <w:spacing w:line="360" w:lineRule="auto" w:before="0" w:after="0"/>
+        <w:ind w:firstLine="420"/>
+        <w:jc w:val="both"/>
+      </w:pPr>
+      <w:r>
+        <w:rPr>
+          <w:rFonts w:ascii="Times New Roman" w:hAnsi="Times New Roman" w:eastAsia="宋体"/>
+          <w:sz w:val="21"/>
+        </w:rPr>
+        <w:t>在更小探头尺度上，Wang等[68]研制外径3.17 mm、基线1.60 mm的双目内窥镜，对1 mm标准长度的平均绝对误差为0.0322 mm；该结果同时暴露了极短基线带来的相对误差。平面镜或棱镜可在单相机中产生虚拟双目[69,71-72]，减少横向封装尺寸，但镜面角度、折射和真实光线模型必须联合标定。面向80～240 mm管道的模块化折反射多方向视觉已发展到2025年的原型系统[74]，但全周覆盖和机器人长距离坐标传递仍待验证。</w:t>
+      </w:r>
+    </w:p>
+    <w:p>
+      <w:pPr>
         <w:pStyle w:val="Heading3"/>
         <w:keepNext/>
         <w:spacing w:before="200" w:after="120"/>
@@ -1097,12 +1332,12 @@
           <w:b/>
           <w:sz w:val="24"/>
         </w:rPr>
-        <w:t>4.3 标定、畸变与复杂表面</w:t>
+        <w:t>5.3 标定、畸变与复杂表面</w:t>
       </w:r>
     </w:p>
     <w:p>
       <w:pPr>
-        <w:spacing w:line="360" w:lineRule="auto" w:after="0" w:before="0"/>
+        <w:spacing w:line="360" w:lineRule="auto" w:before="0" w:after="0"/>
         <w:ind w:firstLine="420"/>
         <w:jc w:val="both"/>
       </w:pPr>
@@ -1116,7 +1351,7 @@
     </w:p>
     <w:p>
       <w:pPr>
-        <w:spacing w:line="360" w:lineRule="auto" w:after="0" w:before="0"/>
+        <w:spacing w:line="360" w:lineRule="auto" w:before="0" w:after="0"/>
         <w:ind w:firstLine="420"/>
         <w:jc w:val="both"/>
       </w:pPr>
@@ -1130,6 +1365,20 @@
     </w:p>
     <w:p>
       <w:pPr>
+        <w:spacing w:line="360" w:lineRule="auto" w:before="0" w:after="0"/>
+        <w:ind w:firstLine="420"/>
+        <w:jc w:val="both"/>
+      </w:pPr>
+      <w:r>
+        <w:rPr>
+          <w:rFonts w:ascii="Times New Roman" w:hAnsi="Times New Roman" w:eastAsia="宋体"/>
+          <w:sz w:val="21"/>
+        </w:rPr>
+        <w:t>严格而言，采用投影条纹的测量内窥镜属于主动光学，但其机械形态和标定问题与内窥视觉紧密相关。面向圆柱内壁的锥镜条纹摄影测量已较早验证[80]，刚性和柔性条纹内窥系统随后形成连续技术链[75-79]：柔性光纤束提升可达性，却降低空间采样和调制度；刚性系统成像质量较高，却难以绕过弯曲入口。手持系统必须进一步解决相邻视场位姿估计、CAD辅助配准和长期外参稳定性。</w:t>
+      </w:r>
+    </w:p>
+    <w:p>
+      <w:pPr>
         <w:pStyle w:val="Heading2"/>
         <w:keepNext/>
         <w:spacing w:before="200" w:after="120"/>
@@ -1140,7 +1389,7 @@
           <w:b/>
           <w:sz w:val="28"/>
         </w:rPr>
-        <w:t>5 主动光学探头测量方法</w:t>
+        <w:t>6 主动光学探头测量方法</w:t>
       </w:r>
     </w:p>
     <w:p>
@@ -1155,12 +1404,12 @@
           <w:b/>
           <w:sz w:val="24"/>
         </w:rPr>
-        <w:t>5.1 激光三角与结构光</w:t>
+        <w:t>6.1 激光三角与结构光</w:t>
       </w:r>
     </w:p>
     <w:p>
       <w:pPr>
-        <w:spacing w:line="360" w:lineRule="auto" w:after="0" w:before="0"/>
+        <w:spacing w:line="360" w:lineRule="auto" w:before="0" w:after="0"/>
         <w:ind w:firstLine="420"/>
         <w:jc w:val="both"/>
       </w:pPr>
@@ -1174,7 +1423,21 @@
     </w:p>
     <w:p>
       <w:pPr>
-        <w:spacing w:line="360" w:lineRule="auto" w:after="0" w:before="0"/>
+        <w:spacing w:line="360" w:lineRule="auto" w:before="0" w:after="0"/>
+        <w:ind w:firstLine="420"/>
+        <w:jc w:val="both"/>
+      </w:pPr>
+      <w:r>
+        <w:rPr>
+          <w:rFonts w:ascii="Times New Roman" w:hAnsi="Times New Roman" w:eastAsia="宋体"/>
+          <w:sz w:val="21"/>
+        </w:rPr>
+        <w:t>环结构光的工业研究可追溯至Inari等[81]的管内圆环投影系统，随后形成圆结构光模型[82]、锥镜环光探头[83]和面向圆柱内壁的联合标定体系[84-86]。早期系统多报告检测分辨率或相对误差，缺少完整不确定度；近期多直径标准器和显式系统误差模型提高了不同孔径和深度下的可迁移性。</w:t>
+      </w:r>
+    </w:p>
+    <w:p>
+      <w:pPr>
+        <w:spacing w:line="360" w:lineRule="auto" w:before="0" w:after="0"/>
         <w:ind w:firstLine="420"/>
         <w:jc w:val="both"/>
       </w:pPr>
@@ -1188,7 +1451,21 @@
     </w:p>
     <w:p>
       <w:pPr>
-        <w:spacing w:line="360" w:lineRule="auto" w:after="0" w:before="0"/>
+        <w:spacing w:line="360" w:lineRule="auto" w:before="0" w:after="0"/>
+        <w:ind w:firstLine="420"/>
+        <w:jc w:val="both"/>
+      </w:pPr>
+      <w:r>
+        <w:rPr>
+          <w:rFonts w:ascii="Times New Roman" w:hAnsi="Times New Roman" w:eastAsia="宋体"/>
+          <w:sz w:val="21"/>
+        </w:rPr>
+        <w:t>旋转机构和折叠光路进一步扩展了复杂深孔与狭槽覆盖[87-88]。多环方案从约50 μm误差、15 μm重复性的早期原型[89]发展到小于10 μm的不确定度报告[29]。对于约300 mm大深孔，基于固定参考点的透视温漂补偿可将两小时重复误差从0.040 mm降至0.012 mm[90]；准直参考光则可同步约束探头姿态[91]。这些结果表明，深孔结构光的性能提升更多来自标定链和位姿补偿，而非单纯提高相机像素数。</w:t>
+      </w:r>
+    </w:p>
+    <w:p>
+      <w:pPr>
+        <w:spacing w:line="360" w:lineRule="auto" w:before="0" w:after="0"/>
         <w:ind w:firstLine="420"/>
         <w:jc w:val="both"/>
       </w:pPr>
@@ -1212,12 +1489,12 @@
           <w:b/>
           <w:sz w:val="24"/>
         </w:rPr>
-        <w:t>5.2 共焦测量</w:t>
+        <w:t>6.2 共焦测量</w:t>
       </w:r>
     </w:p>
     <w:p>
       <w:pPr>
-        <w:spacing w:line="360" w:lineRule="auto" w:after="0" w:before="0"/>
+        <w:spacing w:line="360" w:lineRule="auto" w:before="0" w:after="0"/>
         <w:ind w:firstLine="420"/>
         <w:jc w:val="both"/>
       </w:pPr>
@@ -1231,7 +1508,7 @@
     </w:p>
     <w:p>
       <w:pPr>
-        <w:spacing w:line="360" w:lineRule="auto" w:after="0" w:before="0"/>
+        <w:spacing w:line="360" w:lineRule="auto" w:before="0" w:after="0"/>
         <w:ind w:firstLine="420"/>
         <w:jc w:val="both"/>
       </w:pPr>
@@ -1245,6 +1522,20 @@
     </w:p>
     <w:p>
       <w:pPr>
+        <w:spacing w:line="360" w:lineRule="auto" w:before="0" w:after="0"/>
+        <w:ind w:firstLine="420"/>
+        <w:jc w:val="both"/>
+      </w:pPr>
+      <w:r>
+        <w:rPr>
+          <w:rFonts w:ascii="Times New Roman" w:hAnsi="Times New Roman" w:eastAsia="宋体"/>
+          <w:sz w:val="21"/>
+        </w:rPr>
+        <w:t>中文研究已将光谱共焦旋转测量用于222 mm深、深径比12.52的内孔，低速下内径波动约±2 μm，高速时增至±7 μm[92]。进一步采用阶梯环规和分层误差补偿的系统覆盖大于30:1深径比，报告最大绝对偏差不超过0.2 μm、全深度重复性0.8～1.6 μm及扩展不确定度3.8 μm（\(k=2\)）[93]。后者是纳入证据中少数同时报告全深度性能与覆盖因子的研究。</w:t>
+      </w:r>
+    </w:p>
+    <w:p>
+      <w:pPr>
         <w:pStyle w:val="Heading3"/>
         <w:keepNext/>
         <w:spacing w:before="200" w:after="120"/>
@@ -1255,12 +1546,12 @@
           <w:b/>
           <w:sz w:val="24"/>
         </w:rPr>
-        <w:t>5.3 低相干干涉与光纤微型探头</w:t>
+        <w:t>6.3 低相干干涉与光纤微型探头</w:t>
       </w:r>
     </w:p>
     <w:p>
       <w:pPr>
-        <w:spacing w:line="360" w:lineRule="auto" w:after="0" w:before="0"/>
+        <w:spacing w:line="360" w:lineRule="auto" w:before="0" w:after="0"/>
         <w:ind w:firstLine="420"/>
         <w:jc w:val="both"/>
       </w:pPr>
@@ -1274,7 +1565,21 @@
     </w:p>
     <w:p>
       <w:pPr>
-        <w:spacing w:line="360" w:lineRule="auto" w:after="0" w:before="0"/>
+        <w:spacing w:line="360" w:lineRule="auto" w:before="0" w:after="0"/>
+        <w:ind w:firstLine="420"/>
+        <w:jc w:val="both"/>
+      </w:pPr>
+      <w:r>
+        <w:rPr>
+          <w:rFonts w:ascii="Times New Roman" w:hAnsi="Times New Roman" w:eastAsia="宋体"/>
+          <w:sz w:val="21"/>
+        </w:rPr>
+        <w:t>该路线由空间调制低相干分析和125 μm级全光纤探头逐步发展[94-95]。Ford和Tatam[96]使用无远端机电部件的OCT探头测量约18 mm管道，深度分辨率约8 μm；侧视GRIN光纤轮廓仪在工作距离大于3 mm时获得约200 nm轴向分辨率[97]；以石英管作为内部基准的旋转OCT系统报告0.07 μm重复标准差[98]。这些数字对应不同层级指标，仍不能直接视为同一“精度”排名。</w:t>
+      </w:r>
+    </w:p>
+    <w:p>
+      <w:pPr>
+        <w:spacing w:line="360" w:lineRule="auto" w:before="0" w:after="0"/>
         <w:ind w:firstLine="420"/>
         <w:jc w:val="both"/>
       </w:pPr>
@@ -1298,7 +1603,7 @@
           <w:b/>
           <w:sz w:val="28"/>
         </w:rPr>
-        <w:t>6 狭小空间测量的共性关键技术</w:t>
+        <w:t>7 狭小空间测量的共性关键技术</w:t>
       </w:r>
     </w:p>
     <w:p>
@@ -1313,12 +1618,12 @@
           <w:b/>
           <w:sz w:val="24"/>
         </w:rPr>
-        <w:t>6.1 探头微型化与光路折转</w:t>
+        <w:t>7.1 探头微型化与光路折转</w:t>
       </w:r>
     </w:p>
     <w:p>
       <w:pPr>
-        <w:spacing w:line="360" w:lineRule="auto" w:after="0" w:before="0"/>
+        <w:spacing w:line="360" w:lineRule="auto" w:before="0" w:after="0"/>
         <w:ind w:firstLine="420"/>
         <w:jc w:val="both"/>
       </w:pPr>
@@ -1342,12 +1647,12 @@
           <w:b/>
           <w:sz w:val="24"/>
         </w:rPr>
-        <w:t>6.2 探头位姿与坐标传递</w:t>
+        <w:t>7.2 探头位姿与坐标传递</w:t>
       </w:r>
     </w:p>
     <w:p>
       <w:pPr>
-        <w:spacing w:line="360" w:lineRule="auto" w:after="0" w:before="0"/>
+        <w:spacing w:line="360" w:lineRule="auto" w:before="0" w:after="0"/>
         <w:ind w:firstLine="420"/>
         <w:jc w:val="both"/>
       </w:pPr>
@@ -1361,7 +1666,7 @@
     </w:p>
     <w:p>
       <w:pPr>
-        <w:spacing w:line="360" w:lineRule="auto" w:after="0" w:before="0"/>
+        <w:spacing w:line="360" w:lineRule="auto" w:before="0" w:after="0"/>
         <w:ind w:firstLine="420"/>
         <w:jc w:val="both"/>
       </w:pPr>
@@ -1375,6 +1680,20 @@
     </w:p>
     <w:p>
       <w:pPr>
+        <w:spacing w:line="360" w:lineRule="auto" w:before="0" w:after="0"/>
+        <w:ind w:firstLine="420"/>
+        <w:jc w:val="both"/>
+      </w:pPr>
+      <w:r>
+        <w:rPr>
+          <w:rFonts w:ascii="Times New Roman" w:hAnsi="Times New Roman" w:eastAsia="宋体"/>
+          <w:sz w:val="21"/>
+        </w:rPr>
+        <w:t>受限通视条件下的外部坐标传递也可由机载靶球和激光跟踪仪实现。Gao等[108]在8个控制点上获得小于0.15 mm的三维偏差，并通过蒙特卡洛得到38 μm平移不确定度；其适用于窗口两侧坐标统一，但不适合完全封闭弯曲孔道。多激光位移传感器的光束方向和原点可借助参考结构光标定[109]，说明“位移读数准确”与“探头空间位姿准确”必须分开处理。</w:t>
+      </w:r>
+    </w:p>
+    <w:p>
+      <w:pPr>
         <w:pStyle w:val="Heading3"/>
         <w:keepNext/>
         <w:spacing w:before="200" w:after="120"/>
@@ -1385,12 +1704,12 @@
           <w:b/>
           <w:sz w:val="24"/>
         </w:rPr>
-        <w:t>6.3 系统标定与原位复核</w:t>
+        <w:t>7.3 系统标定与原位复核</w:t>
       </w:r>
     </w:p>
     <w:p>
       <w:pPr>
-        <w:spacing w:line="360" w:lineRule="auto" w:after="0" w:before="0"/>
+        <w:spacing w:line="360" w:lineRule="auto" w:before="0" w:after="0"/>
         <w:ind w:firstLine="420"/>
         <w:jc w:val="both"/>
       </w:pPr>
@@ -1404,7 +1723,7 @@
     </w:p>
     <w:p>
       <w:pPr>
-        <w:spacing w:line="360" w:lineRule="auto" w:after="0" w:before="0"/>
+        <w:spacing w:line="360" w:lineRule="auto" w:before="0" w:after="0"/>
         <w:ind w:firstLine="420"/>
         <w:jc w:val="both"/>
       </w:pPr>
@@ -1418,6 +1737,20 @@
     </w:p>
     <w:p>
       <w:pPr>
+        <w:spacing w:line="360" w:lineRule="auto" w:before="0" w:after="0"/>
+        <w:ind w:firstLine="420"/>
+        <w:jc w:val="both"/>
+      </w:pPr>
+      <w:r>
+        <w:rPr>
+          <w:rFonts w:ascii="Times New Roman" w:hAnsi="Times New Roman" w:eastAsia="宋体"/>
+          <w:sz w:val="21"/>
+        </w:rPr>
+        <w:t>对于标定板无法放入最终工作位置的系统，虚拟平面原位标定可由少量可达平面生成测量体积内约束。Zhang等[110]在小视场条纹系统中报告1.9 μm测量误差标准差，但该结果仍依赖两个实物标定位置的平面度和系统机械稳定性。原位标定应被视为外参更新机制，而非免除标准器溯源的自洽算法。</w:t>
+      </w:r>
+    </w:p>
+    <w:p>
+      <w:pPr>
         <w:pStyle w:val="Heading3"/>
         <w:keepNext/>
         <w:spacing w:before="200" w:after="120"/>
@@ -1428,12 +1761,12 @@
           <w:b/>
           <w:sz w:val="24"/>
         </w:rPr>
-        <w:t>6.4 多视场融合与完整重建</w:t>
+        <w:t>7.4 多视场融合与完整重建</w:t>
       </w:r>
     </w:p>
     <w:p>
       <w:pPr>
-        <w:spacing w:line="360" w:lineRule="auto" w:after="0" w:before="0"/>
+        <w:spacing w:line="360" w:lineRule="auto" w:before="0" w:after="0"/>
         <w:ind w:firstLine="420"/>
         <w:jc w:val="both"/>
       </w:pPr>
@@ -1447,7 +1780,7 @@
     </w:p>
     <w:p>
       <w:pPr>
-        <w:spacing w:line="360" w:lineRule="auto" w:after="0" w:before="0"/>
+        <w:spacing w:line="360" w:lineRule="auto" w:before="0" w:after="0"/>
         <w:ind w:firstLine="420"/>
         <w:jc w:val="both"/>
       </w:pPr>
@@ -1471,12 +1804,12 @@
           <w:b/>
           <w:sz w:val="24"/>
         </w:rPr>
-        <w:t>6.5 误差与不确定度</w:t>
+        <w:t>7.5 误差与不确定度</w:t>
       </w:r>
     </w:p>
     <w:p>
       <w:pPr>
-        <w:spacing w:line="360" w:lineRule="auto" w:after="0" w:before="0"/>
+        <w:spacing w:line="360" w:lineRule="auto" w:before="0" w:after="0"/>
         <w:ind w:firstLine="420"/>
         <w:jc w:val="both"/>
       </w:pPr>
@@ -1490,7 +1823,6 @@
     </w:p>
     <w:p>
       <w:pPr>
-        <w:spacing w:before="120" w:after="120"/>
         <w:jc w:val="center"/>
       </w:pPr>
       <w:r>
@@ -1498,12 +1830,12 @@
           <w:rFonts w:ascii="Cambria Math" w:hAnsi="Cambria Math" w:eastAsia="Cambria Math"/>
           <w:sz w:val="21"/>
         </w:rPr>
-        <w:t>u_c^2(Y)=u_{{std}}^2+u_{{sensor}}^2+ u_{{intrinsic}}^2+u_{{pose}}^2+ u_{{motion}}^2+u_{{registration}}^2+ u_{{surface}}^2+u_{{thermal}}^2+ u_{{algorithm}}^2</w:t>
+        <w:t>u_c^2(Y)=u_{\mathrm{std}}^2+u_{\mathrm{sensor}}^2+ u_{\mathrm{intrinsic}}^2+u_{\mathrm{pose}}^2+ u_{\mathrm{motion}}^2+u_{\mathrm{registration}}^2+ u_{\mathrm{surface}}^2+u_{\mathrm{thermal}}^2+ u_{\mathrm{algorithm}}^2</w:t>
       </w:r>
     </w:p>
     <w:p>
       <w:pPr>
-        <w:spacing w:line="360" w:lineRule="auto" w:after="0" w:before="0"/>
+        <w:spacing w:line="360" w:lineRule="auto" w:before="0" w:after="0"/>
         <w:ind w:firstLine="420"/>
         <w:jc w:val="both"/>
       </w:pPr>
@@ -1527,12 +1859,12 @@
           <w:b/>
           <w:sz w:val="28"/>
         </w:rPr>
-        <w:t>7 测量方法的性能比较</w:t>
+        <w:t>8 测量方法的性能比较</w:t>
       </w:r>
     </w:p>
     <w:p>
       <w:pPr>
-        <w:spacing w:line="360" w:lineRule="auto" w:after="0" w:before="0"/>
+        <w:spacing w:line="360" w:lineRule="auto" w:before="0" w:after="0"/>
         <w:ind w:firstLine="420"/>
         <w:jc w:val="both"/>
       </w:pPr>
@@ -1546,7 +1878,7 @@
     </w:p>
     <w:p>
       <w:pPr>
-        <w:spacing w:line="360" w:lineRule="auto" w:after="0" w:before="0"/>
+        <w:spacing w:line="360" w:lineRule="auto" w:before="0" w:after="0"/>
         <w:ind w:firstLine="420"/>
         <w:jc w:val="both"/>
       </w:pPr>
@@ -1554,6 +1886,7 @@
         <w:rPr>
           <w:rFonts w:ascii="Times New Roman" w:hAnsi="Times New Roman" w:eastAsia="宋体"/>
           <w:b/>
+          <w:i w:val="0"/>
           <w:sz w:val="21"/>
         </w:rPr>
         <w:t>表1 主要方法的能力与限制</w:t>
@@ -1564,7 +1897,6 @@
         <w:tblStyle w:val="TableGrid"/>
         <w:tblW w:type="auto" w:w="0"/>
         <w:jc w:val="center"/>
-        <w:tblLayout w:type="autofit"/>
         <w:tblLook w:firstColumn="1" w:firstRow="1" w:lastColumn="0" w:lastRow="0" w:noHBand="0" w:noVBand="1" w:val="04A0"/>
       </w:tblPr>
       <w:tblGrid>
@@ -1575,9 +1907,6 @@
         <w:gridCol w:w="1769"/>
       </w:tblGrid>
       <w:tr>
-        <w:trPr>
-          <w:tblHeader w:val="true"/>
-        </w:trPr>
         <w:tc>
           <w:tcPr>
             <w:tcW w:type="dxa" w:w="1769"/>
@@ -1594,7 +1923,7 @@
               <w:rPr>
                 <w:rFonts w:ascii="Times New Roman" w:hAnsi="Times New Roman" w:eastAsia="宋体"/>
                 <w:b/>
-                <w:sz w:val="18"/>
+                <w:sz w:val="17"/>
               </w:rPr>
               <w:t>方法</w:t>
             </w:r>
@@ -1616,7 +1945,7 @@
               <w:rPr>
                 <w:rFonts w:ascii="Times New Roman" w:hAnsi="Times New Roman" w:eastAsia="宋体"/>
                 <w:b/>
-                <w:sz w:val="18"/>
+                <w:sz w:val="17"/>
               </w:rPr>
               <w:t>可进入性</w:t>
             </w:r>
@@ -1638,7 +1967,7 @@
               <w:rPr>
                 <w:rFonts w:ascii="Times New Roman" w:hAnsi="Times New Roman" w:eastAsia="宋体"/>
                 <w:b/>
-                <w:sz w:val="18"/>
+                <w:sz w:val="17"/>
               </w:rPr>
               <w:t>主要优势</w:t>
             </w:r>
@@ -1660,7 +1989,7 @@
               <w:rPr>
                 <w:rFonts w:ascii="Times New Roman" w:hAnsi="Times New Roman" w:eastAsia="宋体"/>
                 <w:b/>
-                <w:sz w:val="18"/>
+                <w:sz w:val="17"/>
               </w:rPr>
               <w:t>主要限制</w:t>
             </w:r>
@@ -1682,7 +2011,7 @@
               <w:rPr>
                 <w:rFonts w:ascii="Times New Roman" w:hAnsi="Times New Roman" w:eastAsia="宋体"/>
                 <w:b/>
-                <w:sz w:val="18"/>
+                <w:sz w:val="17"/>
               </w:rPr>
               <w:t>典型任务</w:t>
             </w:r>
@@ -1705,7 +2034,7 @@
               <w:rPr>
                 <w:rFonts w:ascii="Times New Roman" w:hAnsi="Times New Roman" w:eastAsia="宋体"/>
                 <w:b w:val="0"/>
-                <w:sz w:val="18"/>
+                <w:sz w:val="17"/>
               </w:rPr>
               <w:t>细长杆接触探针</w:t>
             </w:r>
@@ -1726,7 +2055,7 @@
               <w:rPr>
                 <w:rFonts w:ascii="Times New Roman" w:hAnsi="Times New Roman" w:eastAsia="宋体"/>
                 <w:b w:val="0"/>
-                <w:sz w:val="18"/>
+                <w:sz w:val="17"/>
               </w:rPr>
               <w:t>中</w:t>
             </w:r>
@@ -1747,7 +2076,7 @@
               <w:rPr>
                 <w:rFonts w:ascii="Times New Roman" w:hAnsi="Times New Roman" w:eastAsia="宋体"/>
                 <w:b w:val="0"/>
-                <w:sz w:val="18"/>
+                <w:sz w:val="17"/>
               </w:rPr>
               <w:t>可溯源、不依赖光学表面</w:t>
             </w:r>
@@ -1768,7 +2097,7 @@
               <w:rPr>
                 <w:rFonts w:ascii="Times New Roman" w:hAnsi="Times New Roman" w:eastAsia="宋体"/>
                 <w:b w:val="0"/>
-                <w:sz w:val="18"/>
+                <w:sz w:val="17"/>
               </w:rPr>
               <w:t>挠曲、预行程、碰撞、速度低</w:t>
             </w:r>
@@ -1789,7 +2118,7 @@
               <w:rPr>
                 <w:rFonts w:ascii="Times New Roman" w:hAnsi="Times New Roman" w:eastAsia="宋体"/>
                 <w:b w:val="0"/>
-                <w:sz w:val="18"/>
+                <w:sz w:val="17"/>
               </w:rPr>
               <w:t>深孔尺寸与形状</w:t>
             </w:r>
@@ -1812,7 +2141,7 @@
               <w:rPr>
                 <w:rFonts w:ascii="Times New Roman" w:hAnsi="Times New Roman" w:eastAsia="宋体"/>
                 <w:b w:val="0"/>
-                <w:sz w:val="18"/>
+                <w:sz w:val="17"/>
               </w:rPr>
               <w:t>微型/光纤接触探针</w:t>
             </w:r>
@@ -1833,7 +2162,7 @@
               <w:rPr>
                 <w:rFonts w:ascii="Times New Roman" w:hAnsi="Times New Roman" w:eastAsia="宋体"/>
                 <w:b w:val="0"/>
-                <w:sz w:val="18"/>
+                <w:sz w:val="17"/>
               </w:rPr>
               <w:t>高</w:t>
             </w:r>
@@ -1854,7 +2183,7 @@
               <w:rPr>
                 <w:rFonts w:ascii="Times New Roman" w:hAnsi="Times New Roman" w:eastAsia="宋体"/>
                 <w:b w:val="0"/>
-                <w:sz w:val="18"/>
+                <w:sz w:val="17"/>
               </w:rPr>
               <w:t>探头小、测力低</w:t>
             </w:r>
@@ -1875,7 +2204,7 @@
               <w:rPr>
                 <w:rFonts w:ascii="Times New Roman" w:hAnsi="Times New Roman" w:eastAsia="宋体"/>
                 <w:b w:val="0"/>
-                <w:sz w:val="18"/>
+                <w:sz w:val="17"/>
               </w:rPr>
               <w:t>粘附、球头标定、完整三维困难</w:t>
             </w:r>
@@ -1896,7 +2225,7 @@
               <w:rPr>
                 <w:rFonts w:ascii="Times New Roman" w:hAnsi="Times New Roman" w:eastAsia="宋体"/>
                 <w:b w:val="0"/>
-                <w:sz w:val="18"/>
+                <w:sz w:val="17"/>
               </w:rPr>
               <w:t>微孔、微槽</w:t>
             </w:r>
@@ -1919,7 +2248,7 @@
               <w:rPr>
                 <w:rFonts w:ascii="Times New Roman" w:hAnsi="Times New Roman" w:eastAsia="宋体"/>
                 <w:b w:val="0"/>
-                <w:sz w:val="18"/>
+                <w:sz w:val="17"/>
               </w:rPr>
               <w:t>单目内窥视觉</w:t>
             </w:r>
@@ -1940,7 +2269,7 @@
               <w:rPr>
                 <w:rFonts w:ascii="Times New Roman" w:hAnsi="Times New Roman" w:eastAsia="宋体"/>
                 <w:b w:val="0"/>
-                <w:sz w:val="18"/>
+                <w:sz w:val="17"/>
               </w:rPr>
               <w:t>高</w:t>
             </w:r>
@@ -1961,7 +2290,7 @@
               <w:rPr>
                 <w:rFonts w:ascii="Times New Roman" w:hAnsi="Times New Roman" w:eastAsia="宋体"/>
                 <w:b w:val="0"/>
-                <w:sz w:val="18"/>
+                <w:sz w:val="17"/>
               </w:rPr>
               <w:t>结构简单、视场大、操作灵活</w:t>
             </w:r>
@@ -1982,7 +2311,7 @@
               <w:rPr>
                 <w:rFonts w:ascii="Times New Roman" w:hAnsi="Times New Roman" w:eastAsia="宋体"/>
                 <w:b w:val="0"/>
-                <w:sz w:val="18"/>
+                <w:sz w:val="17"/>
               </w:rPr>
               <w:t>绝对尺度不可观、依赖先验</w:t>
             </w:r>
@@ -2003,7 +2332,7 @@
               <w:rPr>
                 <w:rFonts w:ascii="Times New Roman" w:hAnsi="Times New Roman" w:eastAsia="宋体"/>
                 <w:b w:val="0"/>
-                <w:sz w:val="18"/>
+                <w:sz w:val="17"/>
               </w:rPr>
               <w:t>已知尺度下的局部尺寸</w:t>
             </w:r>
@@ -2026,7 +2355,7 @@
               <w:rPr>
                 <w:rFonts w:ascii="Times New Roman" w:hAnsi="Times New Roman" w:eastAsia="宋体"/>
                 <w:b w:val="0"/>
-                <w:sz w:val="18"/>
+                <w:sz w:val="17"/>
               </w:rPr>
               <w:t>双目/多目内窥视觉</w:t>
             </w:r>
@@ -2047,7 +2376,7 @@
               <w:rPr>
                 <w:rFonts w:ascii="Times New Roman" w:hAnsi="Times New Roman" w:eastAsia="宋体"/>
                 <w:b w:val="0"/>
-                <w:sz w:val="18"/>
+                <w:sz w:val="17"/>
               </w:rPr>
               <w:t>中至高</w:t>
             </w:r>
@@ -2068,7 +2397,7 @@
               <w:rPr>
                 <w:rFonts w:ascii="Times New Roman" w:hAnsi="Times New Roman" w:eastAsia="宋体"/>
                 <w:b w:val="0"/>
-                <w:sz w:val="18"/>
+                <w:sz w:val="17"/>
               </w:rPr>
               <w:t>面阵、有尺度、适合手持</w:t>
             </w:r>
@@ -2089,7 +2418,7 @@
               <w:rPr>
                 <w:rFonts w:ascii="Times New Roman" w:hAnsi="Times New Roman" w:eastAsia="宋体"/>
                 <w:b w:val="0"/>
-                <w:sz w:val="18"/>
+                <w:sz w:val="17"/>
               </w:rPr>
               <w:t>短基线、弱纹理、反光</w:t>
             </w:r>
@@ -2110,7 +2439,7 @@
               <w:rPr>
                 <w:rFonts w:ascii="Times New Roman" w:hAnsi="Times New Roman" w:eastAsia="宋体"/>
                 <w:b w:val="0"/>
-                <w:sz w:val="18"/>
+                <w:sz w:val="17"/>
               </w:rPr>
               <w:t>叶片、管道三维测量</w:t>
             </w:r>
@@ -2133,7 +2462,7 @@
               <w:rPr>
                 <w:rFonts w:ascii="Times New Roman" w:hAnsi="Times New Roman" w:eastAsia="宋体"/>
                 <w:b w:val="0"/>
-                <w:sz w:val="18"/>
+                <w:sz w:val="17"/>
               </w:rPr>
               <w:t>线/环结构光</w:t>
             </w:r>
@@ -2154,7 +2483,7 @@
               <w:rPr>
                 <w:rFonts w:ascii="Times New Roman" w:hAnsi="Times New Roman" w:eastAsia="宋体"/>
                 <w:b w:val="0"/>
-                <w:sz w:val="18"/>
+                <w:sz w:val="17"/>
               </w:rPr>
               <w:t>中</w:t>
             </w:r>
@@ -2175,7 +2504,7 @@
               <w:rPr>
                 <w:rFonts w:ascii="Times New Roman" w:hAnsi="Times New Roman" w:eastAsia="宋体"/>
                 <w:b w:val="0"/>
-                <w:sz w:val="18"/>
+                <w:sz w:val="17"/>
               </w:rPr>
               <w:t>截面密度高、速度快</w:t>
             </w:r>
@@ -2196,7 +2525,7 @@
               <w:rPr>
                 <w:rFonts w:ascii="Times New Roman" w:hAnsi="Times New Roman" w:eastAsia="宋体"/>
                 <w:b w:val="0"/>
-                <w:sz w:val="18"/>
+                <w:sz w:val="17"/>
               </w:rPr>
               <w:t>遮挡、散斑、多反射、联合标定复杂</w:t>
             </w:r>
@@ -2217,7 +2546,7 @@
               <w:rPr>
                 <w:rFonts w:ascii="Times New Roman" w:hAnsi="Times New Roman" w:eastAsia="宋体"/>
                 <w:b w:val="0"/>
-                <w:sz w:val="18"/>
+                <w:sz w:val="17"/>
               </w:rPr>
               <w:t>深孔和管道内壁</w:t>
             </w:r>
@@ -2240,7 +2569,7 @@
               <w:rPr>
                 <w:rFonts w:ascii="Times New Roman" w:hAnsi="Times New Roman" w:eastAsia="宋体"/>
                 <w:b w:val="0"/>
-                <w:sz w:val="18"/>
+                <w:sz w:val="17"/>
               </w:rPr>
               <w:t>色散共焦</w:t>
             </w:r>
@@ -2261,7 +2590,7 @@
               <w:rPr>
                 <w:rFonts w:ascii="Times New Roman" w:hAnsi="Times New Roman" w:eastAsia="宋体"/>
                 <w:b w:val="0"/>
-                <w:sz w:val="18"/>
+                <w:sz w:val="17"/>
               </w:rPr>
               <w:t>中</w:t>
             </w:r>
@@ -2282,7 +2611,7 @@
               <w:rPr>
                 <w:rFonts w:ascii="Times New Roman" w:hAnsi="Times New Roman" w:eastAsia="宋体"/>
                 <w:b w:val="0"/>
-                <w:sz w:val="18"/>
+                <w:sz w:val="17"/>
               </w:rPr>
               <w:t>微米级局部测距、表面适应性较好</w:t>
             </w:r>
@@ -2303,7 +2632,7 @@
               <w:rPr>
                 <w:rFonts w:ascii="Times New Roman" w:hAnsi="Times New Roman" w:eastAsia="宋体"/>
                 <w:b w:val="0"/>
-                <w:sz w:val="18"/>
+                <w:sz w:val="17"/>
               </w:rPr>
               <w:t>量程小、需螺旋扫描</w:t>
             </w:r>
@@ -2324,7 +2653,7 @@
               <w:rPr>
                 <w:rFonts w:ascii="Times New Roman" w:hAnsi="Times New Roman" w:eastAsia="宋体"/>
                 <w:b w:val="0"/>
-                <w:sz w:val="18"/>
+                <w:sz w:val="17"/>
               </w:rPr>
               <w:t>精密孔形和窄间隙</w:t>
             </w:r>
@@ -2347,7 +2676,7 @@
               <w:rPr>
                 <w:rFonts w:ascii="Times New Roman" w:hAnsi="Times New Roman" w:eastAsia="宋体"/>
                 <w:b w:val="0"/>
-                <w:sz w:val="18"/>
+                <w:sz w:val="17"/>
               </w:rPr>
               <w:t>低相干干涉</w:t>
             </w:r>
@@ -2368,7 +2697,7 @@
               <w:rPr>
                 <w:rFonts w:ascii="Times New Roman" w:hAnsi="Times New Roman" w:eastAsia="宋体"/>
                 <w:b w:val="0"/>
-                <w:sz w:val="18"/>
+                <w:sz w:val="17"/>
               </w:rPr>
               <w:t>很高</w:t>
             </w:r>
@@ -2389,7 +2718,7 @@
               <w:rPr>
                 <w:rFonts w:ascii="Times New Roman" w:hAnsi="Times New Roman" w:eastAsia="宋体"/>
                 <w:b w:val="0"/>
-                <w:sz w:val="18"/>
+                <w:sz w:val="17"/>
               </w:rPr>
               <w:t>远端可极小、局部分辨率高</w:t>
             </w:r>
@@ -2410,7 +2739,7 @@
               <w:rPr>
                 <w:rFonts w:ascii="Times New Roman" w:hAnsi="Times New Roman" w:eastAsia="宋体"/>
                 <w:b w:val="0"/>
-                <w:sz w:val="18"/>
+                <w:sz w:val="17"/>
               </w:rPr>
               <w:t>单点扫描慢、信号与运动敏感</w:t>
             </w:r>
@@ -2431,7 +2760,7 @@
               <w:rPr>
                 <w:rFonts w:ascii="Times New Roman" w:hAnsi="Times New Roman" w:eastAsia="宋体"/>
                 <w:b w:val="0"/>
-                <w:sz w:val="18"/>
+                <w:sz w:val="17"/>
               </w:rPr>
               <w:t>喷孔和小内径</w:t>
             </w:r>
@@ -2442,7 +2771,7 @@
     <w:p/>
     <w:p>
       <w:pPr>
-        <w:spacing w:line="360" w:lineRule="auto" w:after="0" w:before="0"/>
+        <w:spacing w:line="360" w:lineRule="auto" w:before="0" w:after="0"/>
         <w:ind w:firstLine="420"/>
         <w:jc w:val="both"/>
       </w:pPr>
@@ -2456,7 +2785,830 @@
     </w:p>
     <w:p>
       <w:pPr>
-        <w:spacing w:line="360" w:lineRule="auto" w:after="0" w:before="0"/>
+        <w:spacing w:line="360" w:lineRule="auto" w:before="0" w:after="0"/>
+        <w:ind w:firstLine="420"/>
+        <w:jc w:val="both"/>
+      </w:pPr>
+      <w:r>
+        <w:rPr>
+          <w:rFonts w:ascii="Times New Roman" w:hAnsi="Times New Roman" w:eastAsia="宋体"/>
+          <w:b/>
+          <w:i w:val="0"/>
+          <w:sz w:val="21"/>
+        </w:rPr>
+        <w:t>表2 纳入研究中的代表性任务级证据</w:t>
+      </w:r>
+    </w:p>
+    <w:tbl>
+      <w:tblPr>
+        <w:tblStyle w:val="TableGrid"/>
+        <w:tblW w:type="auto" w:w="0"/>
+        <w:jc w:val="center"/>
+        <w:tblLook w:firstColumn="1" w:firstRow="1" w:lastColumn="0" w:lastRow="0" w:noHBand="0" w:noVBand="1" w:val="04A0"/>
+      </w:tblPr>
+      <w:tblGrid>
+        <w:gridCol w:w="2211"/>
+        <w:gridCol w:w="2211"/>
+        <w:gridCol w:w="2211"/>
+        <w:gridCol w:w="2211"/>
+      </w:tblGrid>
+      <w:tr>
+        <w:tc>
+          <w:tcPr>
+            <w:tcW w:type="dxa" w:w="2211"/>
+            <w:vAlign w:val="center"/>
+            <w:shd w:fill="D9EAF7"/>
+          </w:tcPr>
+          <w:p>
+            <w:pPr>
+              <w:spacing w:after="0" w:line="240" w:lineRule="auto"/>
+              <w:jc w:val="center"/>
+            </w:pPr>
+            <w:r/>
+            <w:r>
+              <w:rPr>
+                <w:rFonts w:ascii="Times New Roman" w:hAnsi="Times New Roman" w:eastAsia="宋体"/>
+                <w:b/>
+                <w:sz w:val="17"/>
+              </w:rPr>
+              <w:t>技术与文献</w:t>
+            </w:r>
+          </w:p>
+        </w:tc>
+        <w:tc>
+          <w:tcPr>
+            <w:tcW w:type="dxa" w:w="2211"/>
+            <w:vAlign w:val="center"/>
+            <w:shd w:fill="D9EAF7"/>
+          </w:tcPr>
+          <w:p>
+            <w:pPr>
+              <w:spacing w:after="0" w:line="240" w:lineRule="auto"/>
+              <w:jc w:val="center"/>
+            </w:pPr>
+            <w:r/>
+            <w:r>
+              <w:rPr>
+                <w:rFonts w:ascii="Times New Roman" w:hAnsi="Times New Roman" w:eastAsia="宋体"/>
+                <w:b/>
+                <w:sz w:val="17"/>
+              </w:rPr>
+              <w:t>空间尺度</w:t>
+            </w:r>
+          </w:p>
+        </w:tc>
+        <w:tc>
+          <w:tcPr>
+            <w:tcW w:type="dxa" w:w="2211"/>
+            <w:vAlign w:val="center"/>
+            <w:shd w:fill="D9EAF7"/>
+          </w:tcPr>
+          <w:p>
+            <w:pPr>
+              <w:spacing w:after="0" w:line="240" w:lineRule="auto"/>
+              <w:jc w:val="center"/>
+            </w:pPr>
+            <w:r/>
+            <w:r>
+              <w:rPr>
+                <w:rFonts w:ascii="Times New Roman" w:hAnsi="Times New Roman" w:eastAsia="宋体"/>
+                <w:b/>
+                <w:sz w:val="17"/>
+              </w:rPr>
+              <w:t>任务级结果</w:t>
+            </w:r>
+          </w:p>
+        </w:tc>
+        <w:tc>
+          <w:tcPr>
+            <w:tcW w:type="dxa" w:w="2211"/>
+            <w:vAlign w:val="center"/>
+            <w:shd w:fill="D9EAF7"/>
+          </w:tcPr>
+          <w:p>
+            <w:pPr>
+              <w:spacing w:after="0" w:line="240" w:lineRule="auto"/>
+              <w:jc w:val="center"/>
+            </w:pPr>
+            <w:r/>
+            <w:r>
+              <w:rPr>
+                <w:rFonts w:ascii="Times New Roman" w:hAnsi="Times New Roman" w:eastAsia="宋体"/>
+                <w:b/>
+                <w:sz w:val="17"/>
+              </w:rPr>
+              <w:t>指标性质</w:t>
+            </w:r>
+          </w:p>
+        </w:tc>
+      </w:tr>
+      <w:tr>
+        <w:tc>
+          <w:tcPr>
+            <w:tcW w:type="dxa" w:w="2211"/>
+            <w:vAlign w:val="center"/>
+          </w:tcPr>
+          <w:p>
+            <w:pPr>
+              <w:spacing w:after="0" w:line="240" w:lineRule="auto"/>
+              <w:jc w:val="left"/>
+            </w:pPr>
+            <w:r/>
+            <w:r>
+              <w:rPr>
+                <w:rFonts w:ascii="Times New Roman" w:hAnsi="Times New Roman" w:eastAsia="宋体"/>
+                <w:b w:val="0"/>
+                <w:sz w:val="17"/>
+              </w:rPr>
+              <w:t>光纤接触探针[12]</w:t>
+            </w:r>
+          </w:p>
+        </w:tc>
+        <w:tc>
+          <w:tcPr>
+            <w:tcW w:type="dxa" w:w="2211"/>
+            <w:vAlign w:val="center"/>
+          </w:tcPr>
+          <w:p>
+            <w:pPr>
+              <w:spacing w:after="0" w:line="240" w:lineRule="auto"/>
+              <w:jc w:val="left"/>
+            </w:pPr>
+            <w:r/>
+            <w:r>
+              <w:rPr>
+                <w:rFonts w:ascii="Times New Roman" w:hAnsi="Times New Roman" w:eastAsia="宋体"/>
+                <w:b w:val="0"/>
+                <w:sz w:val="17"/>
+              </w:rPr>
+              <w:t>约100 μm孔、5 mm深</w:t>
+            </w:r>
+          </w:p>
+        </w:tc>
+        <w:tc>
+          <w:tcPr>
+            <w:tcW w:type="dxa" w:w="2211"/>
+            <w:vAlign w:val="center"/>
+          </w:tcPr>
+          <w:p>
+            <w:pPr>
+              <w:spacing w:after="0" w:line="240" w:lineRule="auto"/>
+              <w:jc w:val="left"/>
+            </w:pPr>
+            <w:r/>
+            <w:r>
+              <w:rPr>
+                <w:rFonts w:ascii="Times New Roman" w:hAnsi="Times New Roman" w:eastAsia="宋体"/>
+                <w:b w:val="0"/>
+                <w:sz w:val="17"/>
+              </w:rPr>
+              <w:t>孔径扩展不确定度0.07 μm，k=2</w:t>
+            </w:r>
+          </w:p>
+        </w:tc>
+        <w:tc>
+          <w:tcPr>
+            <w:tcW w:type="dxa" w:w="2211"/>
+            <w:vAlign w:val="center"/>
+          </w:tcPr>
+          <w:p>
+            <w:pPr>
+              <w:spacing w:after="0" w:line="240" w:lineRule="auto"/>
+              <w:jc w:val="left"/>
+            </w:pPr>
+            <w:r/>
+            <w:r>
+              <w:rPr>
+                <w:rFonts w:ascii="Times New Roman" w:hAnsi="Times New Roman" w:eastAsia="宋体"/>
+                <w:b w:val="0"/>
+                <w:sz w:val="17"/>
+              </w:rPr>
+              <w:t>扩展不确定度</w:t>
+            </w:r>
+          </w:p>
+        </w:tc>
+      </w:tr>
+      <w:tr>
+        <w:tc>
+          <w:tcPr>
+            <w:tcW w:type="dxa" w:w="2211"/>
+            <w:vAlign w:val="center"/>
+          </w:tcPr>
+          <w:p>
+            <w:pPr>
+              <w:spacing w:after="0" w:line="240" w:lineRule="auto"/>
+              <w:jc w:val="left"/>
+            </w:pPr>
+            <w:r/>
+            <w:r>
+              <w:rPr>
+                <w:rFonts w:ascii="Times New Roman" w:hAnsi="Times New Roman" w:eastAsia="宋体"/>
+                <w:b w:val="0"/>
+                <w:sz w:val="17"/>
+              </w:rPr>
+              <w:t>微狭槽CMM[63]</w:t>
+            </w:r>
+          </w:p>
+        </w:tc>
+        <w:tc>
+          <w:tcPr>
+            <w:tcW w:type="dxa" w:w="2211"/>
+            <w:vAlign w:val="center"/>
+          </w:tcPr>
+          <w:p>
+            <w:pPr>
+              <w:spacing w:after="0" w:line="240" w:lineRule="auto"/>
+              <w:jc w:val="left"/>
+            </w:pPr>
+            <w:r/>
+            <w:r>
+              <w:rPr>
+                <w:rFonts w:ascii="Times New Roman" w:hAnsi="Times New Roman" w:eastAsia="宋体"/>
+                <w:b w:val="0"/>
+                <w:sz w:val="17"/>
+              </w:rPr>
+              <w:t>85 μm宽、200 mm长槽</w:t>
+            </w:r>
+          </w:p>
+        </w:tc>
+        <w:tc>
+          <w:tcPr>
+            <w:tcW w:type="dxa" w:w="2211"/>
+            <w:vAlign w:val="center"/>
+          </w:tcPr>
+          <w:p>
+            <w:pPr>
+              <w:spacing w:after="0" w:line="240" w:lineRule="auto"/>
+              <w:jc w:val="left"/>
+            </w:pPr>
+            <w:r/>
+            <w:r>
+              <w:rPr>
+                <w:rFonts w:ascii="Times New Roman" w:hAnsi="Times New Roman" w:eastAsia="宋体"/>
+                <w:b w:val="0"/>
+                <w:sz w:val="17"/>
+              </w:rPr>
+              <w:t>槽宽扩展不确定度66.6 nm，k=2</w:t>
+            </w:r>
+          </w:p>
+        </w:tc>
+        <w:tc>
+          <w:tcPr>
+            <w:tcW w:type="dxa" w:w="2211"/>
+            <w:vAlign w:val="center"/>
+          </w:tcPr>
+          <w:p>
+            <w:pPr>
+              <w:spacing w:after="0" w:line="240" w:lineRule="auto"/>
+              <w:jc w:val="left"/>
+            </w:pPr>
+            <w:r/>
+            <w:r>
+              <w:rPr>
+                <w:rFonts w:ascii="Times New Roman" w:hAnsi="Times New Roman" w:eastAsia="宋体"/>
+                <w:b w:val="0"/>
+                <w:sz w:val="17"/>
+              </w:rPr>
+              <w:t>扩展不确定度</w:t>
+            </w:r>
+          </w:p>
+        </w:tc>
+      </w:tr>
+      <w:tr>
+        <w:tc>
+          <w:tcPr>
+            <w:tcW w:type="dxa" w:w="2211"/>
+            <w:vAlign w:val="center"/>
+          </w:tcPr>
+          <w:p>
+            <w:pPr>
+              <w:spacing w:after="0" w:line="240" w:lineRule="auto"/>
+              <w:jc w:val="left"/>
+            </w:pPr>
+            <w:r/>
+            <w:r>
+              <w:rPr>
+                <w:rFonts w:ascii="Times New Roman" w:hAnsi="Times New Roman" w:eastAsia="宋体"/>
+                <w:b w:val="0"/>
+                <w:sz w:val="17"/>
+              </w:rPr>
+              <w:t>钨球头微探针[67]</w:t>
+            </w:r>
+          </w:p>
+        </w:tc>
+        <w:tc>
+          <w:tcPr>
+            <w:tcW w:type="dxa" w:w="2211"/>
+            <w:vAlign w:val="center"/>
+          </w:tcPr>
+          <w:p>
+            <w:pPr>
+              <w:spacing w:after="0" w:line="240" w:lineRule="auto"/>
+              <w:jc w:val="left"/>
+            </w:pPr>
+            <w:r/>
+            <w:r>
+              <w:rPr>
+                <w:rFonts w:ascii="Times New Roman" w:hAnsi="Times New Roman" w:eastAsia="宋体"/>
+                <w:b w:val="0"/>
+                <w:sz w:val="17"/>
+              </w:rPr>
+              <w:t>小于100 μm球头、高深径比孔</w:t>
+            </w:r>
+          </w:p>
+        </w:tc>
+        <w:tc>
+          <w:tcPr>
+            <w:tcW w:type="dxa" w:w="2211"/>
+            <w:vAlign w:val="center"/>
+          </w:tcPr>
+          <w:p>
+            <w:pPr>
+              <w:spacing w:after="0" w:line="240" w:lineRule="auto"/>
+              <w:jc w:val="left"/>
+            </w:pPr>
+            <w:r/>
+            <w:r>
+              <w:rPr>
+                <w:rFonts w:ascii="Times New Roman" w:hAnsi="Times New Roman" w:eastAsia="宋体"/>
+                <w:b w:val="0"/>
+                <w:sz w:val="17"/>
+              </w:rPr>
+              <w:t>直径/圆度扩展不确定度192/226 nm，k=2</w:t>
+            </w:r>
+          </w:p>
+        </w:tc>
+        <w:tc>
+          <w:tcPr>
+            <w:tcW w:type="dxa" w:w="2211"/>
+            <w:vAlign w:val="center"/>
+          </w:tcPr>
+          <w:p>
+            <w:pPr>
+              <w:spacing w:after="0" w:line="240" w:lineRule="auto"/>
+              <w:jc w:val="left"/>
+            </w:pPr>
+            <w:r/>
+            <w:r>
+              <w:rPr>
+                <w:rFonts w:ascii="Times New Roman" w:hAnsi="Times New Roman" w:eastAsia="宋体"/>
+                <w:b w:val="0"/>
+                <w:sz w:val="17"/>
+              </w:rPr>
+              <w:t>扩展不确定度</w:t>
+            </w:r>
+          </w:p>
+        </w:tc>
+      </w:tr>
+      <w:tr>
+        <w:tc>
+          <w:tcPr>
+            <w:tcW w:type="dxa" w:w="2211"/>
+            <w:vAlign w:val="center"/>
+          </w:tcPr>
+          <w:p>
+            <w:pPr>
+              <w:spacing w:after="0" w:line="240" w:lineRule="auto"/>
+              <w:jc w:val="left"/>
+            </w:pPr>
+            <w:r/>
+            <w:r>
+              <w:rPr>
+                <w:rFonts w:ascii="Times New Roman" w:hAnsi="Times New Roman" w:eastAsia="宋体"/>
+                <w:b w:val="0"/>
+                <w:sz w:val="17"/>
+              </w:rPr>
+              <w:t>微型双目内窥镜[68]</w:t>
+            </w:r>
+          </w:p>
+        </w:tc>
+        <w:tc>
+          <w:tcPr>
+            <w:tcW w:type="dxa" w:w="2211"/>
+            <w:vAlign w:val="center"/>
+          </w:tcPr>
+          <w:p>
+            <w:pPr>
+              <w:spacing w:after="0" w:line="240" w:lineRule="auto"/>
+              <w:jc w:val="left"/>
+            </w:pPr>
+            <w:r/>
+            <w:r>
+              <w:rPr>
+                <w:rFonts w:ascii="Times New Roman" w:hAnsi="Times New Roman" w:eastAsia="宋体"/>
+                <w:b w:val="0"/>
+                <w:sz w:val="17"/>
+              </w:rPr>
+              <w:t>3.17 mm探头、1.60 mm基线</w:t>
+            </w:r>
+          </w:p>
+        </w:tc>
+        <w:tc>
+          <w:tcPr>
+            <w:tcW w:type="dxa" w:w="2211"/>
+            <w:vAlign w:val="center"/>
+          </w:tcPr>
+          <w:p>
+            <w:pPr>
+              <w:spacing w:after="0" w:line="240" w:lineRule="auto"/>
+              <w:jc w:val="left"/>
+            </w:pPr>
+            <w:r/>
+            <w:r>
+              <w:rPr>
+                <w:rFonts w:ascii="Times New Roman" w:hAnsi="Times New Roman" w:eastAsia="宋体"/>
+                <w:b w:val="0"/>
+                <w:sz w:val="17"/>
+              </w:rPr>
+              <w:t>1 mm长度平均绝对误差0.0322 mm</w:t>
+            </w:r>
+          </w:p>
+        </w:tc>
+        <w:tc>
+          <w:tcPr>
+            <w:tcW w:type="dxa" w:w="2211"/>
+            <w:vAlign w:val="center"/>
+          </w:tcPr>
+          <w:p>
+            <w:pPr>
+              <w:spacing w:after="0" w:line="240" w:lineRule="auto"/>
+              <w:jc w:val="left"/>
+            </w:pPr>
+            <w:r/>
+            <w:r>
+              <w:rPr>
+                <w:rFonts w:ascii="Times New Roman" w:hAnsi="Times New Roman" w:eastAsia="宋体"/>
+                <w:b w:val="0"/>
+                <w:sz w:val="17"/>
+              </w:rPr>
+              <w:t>平均绝对误差</w:t>
+            </w:r>
+          </w:p>
+        </w:tc>
+      </w:tr>
+      <w:tr>
+        <w:tc>
+          <w:tcPr>
+            <w:tcW w:type="dxa" w:w="2211"/>
+            <w:vAlign w:val="center"/>
+          </w:tcPr>
+          <w:p>
+            <w:pPr>
+              <w:spacing w:after="0" w:line="240" w:lineRule="auto"/>
+              <w:jc w:val="left"/>
+            </w:pPr>
+            <w:r/>
+            <w:r>
+              <w:rPr>
+                <w:rFonts w:ascii="Times New Roman" w:hAnsi="Times New Roman" w:eastAsia="宋体"/>
+                <w:b w:val="0"/>
+                <w:sz w:val="17"/>
+              </w:rPr>
+              <w:t>多相机管道视觉[22]</w:t>
+            </w:r>
+          </w:p>
+        </w:tc>
+        <w:tc>
+          <w:tcPr>
+            <w:tcW w:type="dxa" w:w="2211"/>
+            <w:vAlign w:val="center"/>
+          </w:tcPr>
+          <w:p>
+            <w:pPr>
+              <w:spacing w:after="0" w:line="240" w:lineRule="auto"/>
+              <w:jc w:val="left"/>
+            </w:pPr>
+            <w:r/>
+            <w:r>
+              <w:rPr>
+                <w:rFonts w:ascii="Times New Roman" w:hAnsi="Times New Roman" w:eastAsia="宋体"/>
+                <w:b w:val="0"/>
+                <w:sz w:val="17"/>
+              </w:rPr>
+              <w:t>80～240 mm管径</w:t>
+            </w:r>
+          </w:p>
+        </w:tc>
+        <w:tc>
+          <w:tcPr>
+            <w:tcW w:type="dxa" w:w="2211"/>
+            <w:vAlign w:val="center"/>
+          </w:tcPr>
+          <w:p>
+            <w:pPr>
+              <w:spacing w:after="0" w:line="240" w:lineRule="auto"/>
+              <w:jc w:val="left"/>
+            </w:pPr>
+            <w:r/>
+            <w:r>
+              <w:rPr>
+                <w:rFonts w:ascii="Times New Roman" w:hAnsi="Times New Roman" w:eastAsia="宋体"/>
+                <w:b w:val="0"/>
+                <w:sz w:val="17"/>
+              </w:rPr>
+              <w:t>直径、同轴度误差0.035/0.066 mm</w:t>
+            </w:r>
+          </w:p>
+        </w:tc>
+        <w:tc>
+          <w:tcPr>
+            <w:tcW w:type="dxa" w:w="2211"/>
+            <w:vAlign w:val="center"/>
+          </w:tcPr>
+          <w:p>
+            <w:pPr>
+              <w:spacing w:after="0" w:line="240" w:lineRule="auto"/>
+              <w:jc w:val="left"/>
+            </w:pPr>
+            <w:r/>
+            <w:r>
+              <w:rPr>
+                <w:rFonts w:ascii="Times New Roman" w:hAnsi="Times New Roman" w:eastAsia="宋体"/>
+                <w:b w:val="0"/>
+                <w:sz w:val="17"/>
+              </w:rPr>
+              <w:t>试验示值误差</w:t>
+            </w:r>
+          </w:p>
+        </w:tc>
+      </w:tr>
+      <w:tr>
+        <w:tc>
+          <w:tcPr>
+            <w:tcW w:type="dxa" w:w="2211"/>
+            <w:vAlign w:val="center"/>
+          </w:tcPr>
+          <w:p>
+            <w:pPr>
+              <w:spacing w:after="0" w:line="240" w:lineRule="auto"/>
+              <w:jc w:val="left"/>
+            </w:pPr>
+            <w:r/>
+            <w:r>
+              <w:rPr>
+                <w:rFonts w:ascii="Times New Roman" w:hAnsi="Times New Roman" w:eastAsia="宋体"/>
+                <w:b w:val="0"/>
+                <w:sz w:val="17"/>
+              </w:rPr>
+              <w:t>折叠线结构光[27]</w:t>
+            </w:r>
+          </w:p>
+        </w:tc>
+        <w:tc>
+          <w:tcPr>
+            <w:tcW w:type="dxa" w:w="2211"/>
+            <w:vAlign w:val="center"/>
+          </w:tcPr>
+          <w:p>
+            <w:pPr>
+              <w:spacing w:after="0" w:line="240" w:lineRule="auto"/>
+              <w:jc w:val="left"/>
+            </w:pPr>
+            <w:r/>
+            <w:r>
+              <w:rPr>
+                <w:rFonts w:ascii="Times New Roman" w:hAnsi="Times New Roman" w:eastAsia="宋体"/>
+                <w:b w:val="0"/>
+                <w:sz w:val="17"/>
+              </w:rPr>
+              <w:t>探头厚度约6 mm</w:t>
+            </w:r>
+          </w:p>
+        </w:tc>
+        <w:tc>
+          <w:tcPr>
+            <w:tcW w:type="dxa" w:w="2211"/>
+            <w:vAlign w:val="center"/>
+          </w:tcPr>
+          <w:p>
+            <w:pPr>
+              <w:spacing w:after="0" w:line="240" w:lineRule="auto"/>
+              <w:jc w:val="left"/>
+            </w:pPr>
+            <w:r/>
+            <w:r>
+              <w:rPr>
+                <w:rFonts w:ascii="Times New Roman" w:hAnsi="Times New Roman" w:eastAsia="宋体"/>
+                <w:b w:val="0"/>
+                <w:sz w:val="17"/>
+              </w:rPr>
+              <w:t>量块三维重建误差小于10 μm</w:t>
+            </w:r>
+          </w:p>
+        </w:tc>
+        <w:tc>
+          <w:tcPr>
+            <w:tcW w:type="dxa" w:w="2211"/>
+            <w:vAlign w:val="center"/>
+          </w:tcPr>
+          <w:p>
+            <w:pPr>
+              <w:spacing w:after="0" w:line="240" w:lineRule="auto"/>
+              <w:jc w:val="left"/>
+            </w:pPr>
+            <w:r/>
+            <w:r>
+              <w:rPr>
+                <w:rFonts w:ascii="Times New Roman" w:hAnsi="Times New Roman" w:eastAsia="宋体"/>
+                <w:b w:val="0"/>
+                <w:sz w:val="17"/>
+              </w:rPr>
+              <w:t>参考偏差</w:t>
+            </w:r>
+          </w:p>
+        </w:tc>
+      </w:tr>
+      <w:tr>
+        <w:tc>
+          <w:tcPr>
+            <w:tcW w:type="dxa" w:w="2211"/>
+            <w:vAlign w:val="center"/>
+          </w:tcPr>
+          <w:p>
+            <w:pPr>
+              <w:spacing w:after="0" w:line="240" w:lineRule="auto"/>
+              <w:jc w:val="left"/>
+            </w:pPr>
+            <w:r/>
+            <w:r>
+              <w:rPr>
+                <w:rFonts w:ascii="Times New Roman" w:hAnsi="Times New Roman" w:eastAsia="宋体"/>
+                <w:b w:val="0"/>
+                <w:sz w:val="17"/>
+              </w:rPr>
+              <w:t>多环结构光[29]</w:t>
+            </w:r>
+          </w:p>
+        </w:tc>
+        <w:tc>
+          <w:tcPr>
+            <w:tcW w:type="dxa" w:w="2211"/>
+            <w:vAlign w:val="center"/>
+          </w:tcPr>
+          <w:p>
+            <w:pPr>
+              <w:spacing w:after="0" w:line="240" w:lineRule="auto"/>
+              <w:jc w:val="left"/>
+            </w:pPr>
+            <w:r/>
+            <w:r>
+              <w:rPr>
+                <w:rFonts w:ascii="Times New Roman" w:hAnsi="Times New Roman" w:eastAsia="宋体"/>
+                <w:b w:val="0"/>
+                <w:sz w:val="17"/>
+              </w:rPr>
+              <w:t>最小内径15 mm</w:t>
+            </w:r>
+          </w:p>
+        </w:tc>
+        <w:tc>
+          <w:tcPr>
+            <w:tcW w:type="dxa" w:w="2211"/>
+            <w:vAlign w:val="center"/>
+          </w:tcPr>
+          <w:p>
+            <w:pPr>
+              <w:spacing w:after="0" w:line="240" w:lineRule="auto"/>
+              <w:jc w:val="left"/>
+            </w:pPr>
+            <w:r/>
+            <w:r>
+              <w:rPr>
+                <w:rFonts w:ascii="Times New Roman" w:hAnsi="Times New Roman" w:eastAsia="宋体"/>
+                <w:b w:val="0"/>
+                <w:sz w:val="17"/>
+              </w:rPr>
+              <w:t>平均误差和不确定度均小于10 μm</w:t>
+            </w:r>
+          </w:p>
+        </w:tc>
+        <w:tc>
+          <w:tcPr>
+            <w:tcW w:type="dxa" w:w="2211"/>
+            <w:vAlign w:val="center"/>
+          </w:tcPr>
+          <w:p>
+            <w:pPr>
+              <w:spacing w:after="0" w:line="240" w:lineRule="auto"/>
+              <w:jc w:val="left"/>
+            </w:pPr>
+            <w:r/>
+            <w:r>
+              <w:rPr>
+                <w:rFonts w:ascii="Times New Roman" w:hAnsi="Times New Roman" w:eastAsia="宋体"/>
+                <w:b w:val="0"/>
+                <w:sz w:val="17"/>
+              </w:rPr>
+              <w:t>论文报告不确定度</w:t>
+            </w:r>
+          </w:p>
+        </w:tc>
+      </w:tr>
+      <w:tr>
+        <w:tc>
+          <w:tcPr>
+            <w:tcW w:type="dxa" w:w="2211"/>
+            <w:vAlign w:val="center"/>
+          </w:tcPr>
+          <w:p>
+            <w:pPr>
+              <w:spacing w:after="0" w:line="240" w:lineRule="auto"/>
+              <w:jc w:val="left"/>
+            </w:pPr>
+            <w:r/>
+            <w:r>
+              <w:rPr>
+                <w:rFonts w:ascii="Times New Roman" w:hAnsi="Times New Roman" w:eastAsia="宋体"/>
+                <w:b w:val="0"/>
+                <w:sz w:val="17"/>
+              </w:rPr>
+              <w:t>光谱共焦深孔[93]</w:t>
+            </w:r>
+          </w:p>
+        </w:tc>
+        <w:tc>
+          <w:tcPr>
+            <w:tcW w:type="dxa" w:w="2211"/>
+            <w:vAlign w:val="center"/>
+          </w:tcPr>
+          <w:p>
+            <w:pPr>
+              <w:spacing w:after="0" w:line="240" w:lineRule="auto"/>
+              <w:jc w:val="left"/>
+            </w:pPr>
+            <w:r/>
+            <w:r>
+              <w:rPr>
+                <w:rFonts w:ascii="Times New Roman" w:hAnsi="Times New Roman" w:eastAsia="宋体"/>
+                <w:b w:val="0"/>
+                <w:sz w:val="17"/>
+              </w:rPr>
+              <w:t>深径比大于30:1</w:t>
+            </w:r>
+          </w:p>
+        </w:tc>
+        <w:tc>
+          <w:tcPr>
+            <w:tcW w:type="dxa" w:w="2211"/>
+            <w:vAlign w:val="center"/>
+          </w:tcPr>
+          <w:p>
+            <w:pPr>
+              <w:spacing w:after="0" w:line="240" w:lineRule="auto"/>
+              <w:jc w:val="left"/>
+            </w:pPr>
+            <w:r/>
+            <w:r>
+              <w:rPr>
+                <w:rFonts w:ascii="Times New Roman" w:hAnsi="Times New Roman" w:eastAsia="宋体"/>
+                <w:b w:val="0"/>
+                <w:sz w:val="17"/>
+              </w:rPr>
+              <w:t>扩展不确定度3.8 μm，k=2</w:t>
+            </w:r>
+          </w:p>
+        </w:tc>
+        <w:tc>
+          <w:tcPr>
+            <w:tcW w:type="dxa" w:w="2211"/>
+            <w:vAlign w:val="center"/>
+          </w:tcPr>
+          <w:p>
+            <w:pPr>
+              <w:spacing w:after="0" w:line="240" w:lineRule="auto"/>
+              <w:jc w:val="left"/>
+            </w:pPr>
+            <w:r/>
+            <w:r>
+              <w:rPr>
+                <w:rFonts w:ascii="Times New Roman" w:hAnsi="Times New Roman" w:eastAsia="宋体"/>
+                <w:b w:val="0"/>
+                <w:sz w:val="17"/>
+              </w:rPr>
+              <w:t>扩展不确定度</w:t>
+            </w:r>
+          </w:p>
+        </w:tc>
+      </w:tr>
+    </w:tbl>
+    <w:p/>
+    <w:p>
+      <w:pPr>
+        <w:spacing w:line="360" w:lineRule="auto" w:before="0" w:after="0"/>
+        <w:ind w:firstLine="420"/>
+        <w:jc w:val="both"/>
+      </w:pPr>
+      <w:r>
+        <w:rPr>
+          <w:rFonts w:ascii="Times New Roman" w:hAnsi="Times New Roman" w:eastAsia="宋体"/>
+          <w:sz w:val="21"/>
+        </w:rPr>
+        <w:t>表2不用于直接排序。不同研究的被测量、覆盖范围、参考标准和统计定义不同；其作用是揭示“局部读出分辨率”与“最终任务不确定度”之间可能存在数个数量级差异。</w:t>
+      </w:r>
+    </w:p>
+    <w:p>
+      <w:pPr>
+        <w:spacing w:line="360" w:lineRule="auto" w:before="0" w:after="0"/>
         <w:ind w:firstLine="420"/>
         <w:jc w:val="both"/>
       </w:pPr>
@@ -2480,7 +3632,7 @@
           <w:b/>
           <w:sz w:val="28"/>
         </w:rPr>
-        <w:t>8 典型应用进展</w:t>
+        <w:t>9 典型应用进展</w:t>
       </w:r>
     </w:p>
     <w:p>
@@ -2495,12 +3647,12 @@
           <w:b/>
           <w:sz w:val="24"/>
         </w:rPr>
-        <w:t>8.1 深孔、盲孔与微孔</w:t>
+        <w:t>9.1 深孔、盲孔与微孔</w:t>
       </w:r>
     </w:p>
     <w:p>
       <w:pPr>
-        <w:spacing w:line="360" w:lineRule="auto" w:after="0" w:before="0"/>
+        <w:spacing w:line="360" w:lineRule="auto" w:before="0" w:after="0"/>
         <w:ind w:firstLine="420"/>
         <w:jc w:val="both"/>
       </w:pPr>
@@ -2514,6 +3666,20 @@
     </w:p>
     <w:p>
       <w:pPr>
+        <w:spacing w:line="360" w:lineRule="auto" w:before="0" w:after="0"/>
+        <w:ind w:firstLine="420"/>
+        <w:jc w:val="both"/>
+      </w:pPr>
+      <w:r>
+        <w:rPr>
+          <w:rFonts w:ascii="Times New Roman" w:hAnsi="Times New Roman" w:eastAsia="宋体"/>
+          <w:sz w:val="21"/>
+        </w:rPr>
+        <w:t>大型深孔系统通常采用多传感器误差分离或激光导向。Song等[99]面向直径约150～165 mm、长度0.6～20 m深孔，将圆度和轴线直线度误差控制在10 μm量级；Katsuki等[100]以光学位姿监测测量17～21 mm孔径、最长1000 mm深孔；在机自定心装置则覆盖约100 mm×700 mm盲孔[101]。三者的尺度、基准和任务均不同，说明“深孔”不能仅用单一深径比归类。</w:t>
+      </w:r>
+    </w:p>
+    <w:p>
+      <w:pPr>
         <w:pStyle w:val="Heading3"/>
         <w:keepNext/>
         <w:spacing w:before="200" w:after="120"/>
@@ -2524,12 +3690,12 @@
           <w:b/>
           <w:sz w:val="24"/>
         </w:rPr>
-        <w:t>8.2 管道与复杂流道</w:t>
+        <w:t>9.2 管道与复杂流道</w:t>
       </w:r>
     </w:p>
     <w:p>
       <w:pPr>
-        <w:spacing w:line="360" w:lineRule="auto" w:after="0" w:before="0"/>
+        <w:spacing w:line="360" w:lineRule="auto" w:before="0" w:after="0"/>
         <w:ind w:firstLine="420"/>
         <w:jc w:val="both"/>
       </w:pPr>
@@ -2543,6 +3709,20 @@
     </w:p>
     <w:p>
       <w:pPr>
+        <w:spacing w:line="360" w:lineRule="auto" w:before="0" w:after="0"/>
+        <w:ind w:firstLine="420"/>
+        <w:jc w:val="both"/>
+      </w:pPr>
+      <w:r>
+        <w:rPr>
+          <w:rFonts w:ascii="Times New Roman" w:hAnsi="Times New Roman" w:eastAsia="宋体"/>
+          <w:sz w:val="21"/>
+        </w:rPr>
+        <w:t>面向较大管径，单程深度相机阵列可实现约1 mm局部几何精度和小于0.5%的长距离误差[103]，但不能替代微米级精密管计量。轴向立体扫描内窥镜测量约7 mm内螺纹时，与X射线参考模型的比较误差约0.433 mm[102]，证明“能够重建”与“满足尺寸公差”之间仍有明显距离。管道机器人研究应同时给出局部轮廓误差和全局轨迹漂移。</w:t>
+      </w:r>
+    </w:p>
+    <w:p>
+      <w:pPr>
         <w:pStyle w:val="Heading3"/>
         <w:keepNext/>
         <w:spacing w:before="200" w:after="120"/>
@@ -2553,12 +3733,12 @@
           <w:b/>
           <w:sz w:val="24"/>
         </w:rPr>
-        <w:t>8.3 航空发动机内腔</w:t>
+        <w:t>9.3 航空发动机内腔</w:t>
       </w:r>
     </w:p>
     <w:p>
       <w:pPr>
-        <w:spacing w:line="360" w:lineRule="auto" w:after="0" w:before="0"/>
+        <w:spacing w:line="360" w:lineRule="auto" w:before="0" w:after="0"/>
         <w:ind w:firstLine="420"/>
         <w:jc w:val="both"/>
       </w:pPr>
@@ -2572,6 +3752,20 @@
     </w:p>
     <w:p>
       <w:pPr>
+        <w:spacing w:line="360" w:lineRule="auto" w:before="0" w:after="0"/>
+        <w:ind w:firstLine="420"/>
+        <w:jc w:val="both"/>
+      </w:pPr>
+      <w:r>
+        <w:rPr>
+          <w:rFonts w:ascii="Times New Roman" w:hAnsi="Times New Roman" w:eastAsia="宋体"/>
+          <w:sz w:val="21"/>
+        </w:rPr>
+        <w:t>冷却孔测量涵盖孔口直径、倾角、孔位和全深度轮廓，其方法与证据已由Yan等[104]系统总结。整叶片条纹投影与参考叶片配准可为涂层后激光复孔提供坐标[105]，但被完全覆盖孔仍需名义模型推断。叶尖间隙综述表明电容、电感、微波和光纤方法的性能来自不同试验台[106]；高温电感系统虽在1000 ℃下达到约10 μm动态分辨率[107]，分辨率仍不等于发动机工况下的绝对间隙不确定度。</w:t>
+      </w:r>
+    </w:p>
+    <w:p>
+      <w:pPr>
         <w:pStyle w:val="Heading3"/>
         <w:keepNext/>
         <w:spacing w:before="200" w:after="120"/>
@@ -2582,12 +3776,12 @@
           <w:b/>
           <w:sz w:val="24"/>
         </w:rPr>
-        <w:t>8.4 窄间隙与复杂内表面</w:t>
+        <w:t>9.4 窄间隙与复杂内表面</w:t>
       </w:r>
     </w:p>
     <w:p>
       <w:pPr>
-        <w:spacing w:line="360" w:lineRule="auto" w:after="0" w:before="0"/>
+        <w:spacing w:line="360" w:lineRule="auto" w:before="0" w:after="0"/>
         <w:ind w:firstLine="420"/>
         <w:jc w:val="both"/>
       </w:pPr>
@@ -2611,7 +3805,7 @@
           <w:b/>
           <w:sz w:val="28"/>
         </w:rPr>
-        <w:t>9 关键问题与发展趋势</w:t>
+        <w:t>10 关键问题与发展趋势</w:t>
       </w:r>
     </w:p>
     <w:p>
@@ -2626,12 +3820,12 @@
           <w:b/>
           <w:sz w:val="24"/>
         </w:rPr>
-        <w:t>9.1 从局部高分辨率向全链高准确度发展</w:t>
+        <w:t>10.1 从局部高分辨率向全链高准确度发展</w:t>
       </w:r>
     </w:p>
     <w:p>
       <w:pPr>
-        <w:spacing w:line="360" w:lineRule="auto" w:after="0" w:before="0"/>
+        <w:spacing w:line="360" w:lineRule="auto" w:before="0" w:after="0"/>
         <w:ind w:firstLine="420"/>
         <w:jc w:val="both"/>
       </w:pPr>
@@ -2655,12 +3849,12 @@
           <w:b/>
           <w:sz w:val="24"/>
         </w:rPr>
-        <w:t>9.2 多模态微型探头</w:t>
+        <w:t>10.2 多模态微型探头</w:t>
       </w:r>
     </w:p>
     <w:p>
       <w:pPr>
-        <w:spacing w:line="360" w:lineRule="auto" w:after="0" w:before="0"/>
+        <w:spacing w:line="360" w:lineRule="auto" w:before="0" w:after="0"/>
         <w:ind w:firstLine="420"/>
         <w:jc w:val="both"/>
       </w:pPr>
@@ -2684,12 +3878,12 @@
           <w:b/>
           <w:sz w:val="24"/>
         </w:rPr>
-        <w:t>9.3 原位自标定与智能位姿感知</w:t>
+        <w:t>10.3 原位自标定与智能位姿感知</w:t>
       </w:r>
     </w:p>
     <w:p>
       <w:pPr>
-        <w:spacing w:line="360" w:lineRule="auto" w:after="0" w:before="0"/>
+        <w:spacing w:line="360" w:lineRule="auto" w:before="0" w:after="0"/>
         <w:ind w:firstLine="420"/>
         <w:jc w:val="both"/>
       </w:pPr>
@@ -2713,12 +3907,12 @@
           <w:b/>
           <w:sz w:val="24"/>
         </w:rPr>
-        <w:t>9.4 复杂表面的物理—数据融合</w:t>
+        <w:t>10.4 复杂表面的物理—数据融合</w:t>
       </w:r>
     </w:p>
     <w:p>
       <w:pPr>
-        <w:spacing w:line="360" w:lineRule="auto" w:after="0" w:before="0"/>
+        <w:spacing w:line="360" w:lineRule="auto" w:before="0" w:after="0"/>
         <w:ind w:firstLine="420"/>
         <w:jc w:val="both"/>
       </w:pPr>
@@ -2742,12 +3936,12 @@
           <w:b/>
           <w:sz w:val="24"/>
         </w:rPr>
-        <w:t>9.5 柔性机器人与自主测量</w:t>
+        <w:t>10.5 柔性机器人与自主测量</w:t>
       </w:r>
     </w:p>
     <w:p>
       <w:pPr>
-        <w:spacing w:line="360" w:lineRule="auto" w:after="0" w:before="0"/>
+        <w:spacing w:line="360" w:lineRule="auto" w:before="0" w:after="0"/>
         <w:ind w:firstLine="420"/>
         <w:jc w:val="both"/>
       </w:pPr>
@@ -2771,12 +3965,12 @@
           <w:b/>
           <w:sz w:val="24"/>
         </w:rPr>
-        <w:t>9.6 标准器、数据集与评价规范</w:t>
+        <w:t>10.6 标准器、数据集与评价规范</w:t>
       </w:r>
     </w:p>
     <w:p>
       <w:pPr>
-        <w:spacing w:line="360" w:lineRule="auto" w:after="0" w:before="0"/>
+        <w:spacing w:line="360" w:lineRule="auto" w:before="0" w:after="0"/>
         <w:ind w:firstLine="420"/>
         <w:jc w:val="both"/>
       </w:pPr>
@@ -2790,6 +3984,20 @@
     </w:p>
     <w:p>
       <w:pPr>
+        <w:spacing w:line="360" w:lineRule="auto" w:before="0" w:after="0"/>
+        <w:ind w:firstLine="420"/>
+        <w:jc w:val="both"/>
+      </w:pPr>
+      <w:r>
+        <w:rPr>
+          <w:rFonts w:ascii="Times New Roman" w:hAnsi="Times New Roman" w:eastAsia="宋体"/>
+          <w:sz w:val="21"/>
+        </w:rPr>
+        <w:t>系统检索还暴露出报告层面的结构性缺口：多数论文未给标准器参考值的不确定度，少数只报告最佳点或单一标准差；表面材料、粗糙度、是否喷涂和探头重装条件也经常缺失。后续研究应同时发布原始误差、样本量、重复性、环境条件、标定参数协方差和任务级扩展不确定度，使跨实验室证据真正可比较。</w:t>
+      </w:r>
+    </w:p>
+    <w:p>
+      <w:pPr>
         <w:pStyle w:val="Heading2"/>
         <w:keepNext/>
         <w:spacing w:before="200" w:after="120"/>
@@ -2800,12 +4008,12 @@
           <w:b/>
           <w:sz w:val="28"/>
         </w:rPr>
-        <w:t>10 结论</w:t>
+        <w:t>11 结论</w:t>
       </w:r>
     </w:p>
     <w:p>
       <w:pPr>
-        <w:spacing w:line="360" w:lineRule="auto" w:after="0" w:before="0"/>
+        <w:spacing w:line="360" w:lineRule="auto" w:before="0" w:after="0"/>
         <w:ind w:firstLine="420"/>
         <w:jc w:val="both"/>
       </w:pPr>
@@ -2819,7 +4027,7 @@
     </w:p>
     <w:p>
       <w:pPr>
-        <w:spacing w:line="360" w:lineRule="auto" w:after="0" w:before="0"/>
+        <w:spacing w:line="360" w:lineRule="auto" w:before="0" w:after="0"/>
         <w:ind w:firstLine="420"/>
         <w:jc w:val="both"/>
       </w:pPr>
@@ -3432,6 +4640,958 @@
           <w:sz w:val="18"/>
         </w:rPr>
         <w:t>[42] ISO. ISO 15530-3:2011 Geometrical product specifications (GPS)—Coordinate measuring machines (CMM): Technique for determining the uncertainty of measurement—Part 3: Use of calibrated workpieces or measurement standards[S]. Geneva: ISO, 2011.</w:t>
+      </w:r>
+    </w:p>
+    <w:p>
+      <w:pPr>
+        <w:spacing w:line="240" w:lineRule="auto" w:after="60"/>
+        <w:ind w:left="420" w:hanging="420"/>
+        <w:jc w:val="both"/>
+      </w:pPr>
+      <w:r>
+        <w:rPr>
+          <w:rFonts w:ascii="Times New Roman" w:hAnsi="Times New Roman" w:eastAsia="宋体"/>
+          <w:sz w:val="18"/>
+        </w:rPr>
+        <w:t>[43] Page M J, McKenzie J E, Bossuyt P M, et al. The PRISMA 2020 statement: An updated guideline for reporting systematic reviews[J]. BMJ, 2021, 372: n71. DOI: 10.1136/bmj.n71.</w:t>
+      </w:r>
+    </w:p>
+    <w:p>
+      <w:pPr>
+        <w:spacing w:line="240" w:lineRule="auto" w:after="60"/>
+        <w:ind w:left="420" w:hanging="420"/>
+        <w:jc w:val="both"/>
+      </w:pPr>
+      <w:r>
+        <w:rPr>
+          <w:rFonts w:ascii="Times New Roman" w:hAnsi="Times New Roman" w:eastAsia="宋体"/>
+          <w:sz w:val="18"/>
+        </w:rPr>
+        <w:t>[44] Rethlefsen M L, Kirtley S, Waffenschmidt S, et al. PRISMA-S: An extension to the PRISMA statement for reporting literature searches in systematic reviews[J]. Systematic Reviews, 2021, 10: 39. DOI: 10.1186/s13643-020-01542-z.</w:t>
+      </w:r>
+    </w:p>
+    <w:p>
+      <w:pPr>
+        <w:spacing w:line="240" w:lineRule="auto" w:after="60"/>
+        <w:ind w:left="420" w:hanging="420"/>
+        <w:jc w:val="both"/>
+      </w:pPr>
+      <w:r>
+        <w:rPr>
+          <w:rFonts w:ascii="Times New Roman" w:hAnsi="Times New Roman" w:eastAsia="宋体"/>
+          <w:sz w:val="18"/>
+        </w:rPr>
+        <w:t>[45] Campbell M, McKenzie J E, Sowden A, et al. Synthesis without meta-analysis (SWiM) in systematic reviews: Reporting guideline[J]. BMJ, 2020, 368: l6890. DOI: 10.1136/bmj.l6890.</w:t>
+      </w:r>
+    </w:p>
+    <w:p>
+      <w:pPr>
+        <w:spacing w:line="240" w:lineRule="auto" w:after="60"/>
+        <w:ind w:left="420" w:hanging="420"/>
+        <w:jc w:val="both"/>
+      </w:pPr>
+      <w:r>
+        <w:rPr>
+          <w:rFonts w:ascii="Times New Roman" w:hAnsi="Times New Roman" w:eastAsia="宋体"/>
+          <w:sz w:val="18"/>
+        </w:rPr>
+        <w:t>[46] Castillo A, Grbović P J. The APISSER methodology for systematic literature reviews in engineering[J]. IEEE Access, 2022, 10: 23700-23707. DOI: 10.1109/ACCESS.2022.3148206.</w:t>
+      </w:r>
+    </w:p>
+    <w:p>
+      <w:pPr>
+        <w:spacing w:line="240" w:lineRule="auto" w:after="60"/>
+        <w:ind w:left="420" w:hanging="420"/>
+        <w:jc w:val="both"/>
+      </w:pPr>
+      <w:r>
+        <w:rPr>
+          <w:rFonts w:ascii="Times New Roman" w:hAnsi="Times New Roman" w:eastAsia="宋体"/>
+          <w:sz w:val="18"/>
+        </w:rPr>
+        <w:t>[47] JCGM. International vocabulary of metrology—Basic and general concepts and associated terms (VIM): JCGM 200:2012[S]. 3rd ed. 2012. DOI: 10.59161/JCGM200-2012.</w:t>
+      </w:r>
+    </w:p>
+    <w:p>
+      <w:pPr>
+        <w:spacing w:line="240" w:lineRule="auto" w:after="60"/>
+        <w:ind w:left="420" w:hanging="420"/>
+        <w:jc w:val="both"/>
+      </w:pPr>
+      <w:r>
+        <w:rPr>
+          <w:rFonts w:ascii="Times New Roman" w:hAnsi="Times New Roman" w:eastAsia="宋体"/>
+          <w:sz w:val="18"/>
+        </w:rPr>
+        <w:t>[48] ISO. ISO 5725-1:2023 Accuracy (trueness and precision) of measurement methods and results—Part 1: General principles and definitions[S]. Geneva: ISO, 2023.</w:t>
+      </w:r>
+    </w:p>
+    <w:p>
+      <w:pPr>
+        <w:spacing w:line="240" w:lineRule="auto" w:after="60"/>
+        <w:ind w:left="420" w:hanging="420"/>
+        <w:jc w:val="both"/>
+      </w:pPr>
+      <w:r>
+        <w:rPr>
+          <w:rFonts w:ascii="Times New Roman" w:hAnsi="Times New Roman" w:eastAsia="宋体"/>
+          <w:sz w:val="18"/>
+        </w:rPr>
+        <w:t>[49] Estler W T, Phillips S D, Borchardt B R, et al. Error compensation for CMM touch trigger probes[J]. Precision Engineering, 1996, 19(2-3): 85-97. DOI: 10.1016/S0141-6359(96)00040-2.</w:t>
+      </w:r>
+    </w:p>
+    <w:p>
+      <w:pPr>
+        <w:spacing w:line="240" w:lineRule="auto" w:after="60"/>
+        <w:ind w:left="420" w:hanging="420"/>
+        <w:jc w:val="both"/>
+      </w:pPr>
+      <w:r>
+        <w:rPr>
+          <w:rFonts w:ascii="Times New Roman" w:hAnsi="Times New Roman" w:eastAsia="宋体"/>
+          <w:sz w:val="18"/>
+        </w:rPr>
+        <w:t>[50] Shen Y L, Springer M E. A robust pretravel model for touch trigger probes in coordinate metrology[J]. Journal of Manufacturing Science and Engineering, 1998, 120(3): 532-539. DOI: 10.1115/1.2830156.</w:t>
+      </w:r>
+    </w:p>
+    <w:p>
+      <w:pPr>
+        <w:spacing w:line="240" w:lineRule="auto" w:after="60"/>
+        <w:ind w:left="420" w:hanging="420"/>
+        <w:jc w:val="both"/>
+      </w:pPr>
+      <w:r>
+        <w:rPr>
+          <w:rFonts w:ascii="Times New Roman" w:hAnsi="Times New Roman" w:eastAsia="宋体"/>
+          <w:sz w:val="18"/>
+        </w:rPr>
+        <w:t>[51] Masuzawa T, Hamasaki Y, Fujino M. Vibroscanning method for nondestructive measurement of small holes[J]. CIRP Annals, 1993, 42(1): 589-592. DOI: 10.1016/S0007-8506(07)62516-5.</w:t>
+      </w:r>
+    </w:p>
+    <w:p>
+      <w:pPr>
+        <w:spacing w:line="240" w:lineRule="auto" w:after="60"/>
+        <w:ind w:left="420" w:hanging="420"/>
+        <w:jc w:val="both"/>
+      </w:pPr>
+      <w:r>
+        <w:rPr>
+          <w:rFonts w:ascii="Times New Roman" w:hAnsi="Times New Roman" w:eastAsia="宋体"/>
+          <w:sz w:val="18"/>
+        </w:rPr>
+        <w:t>[52] Masuzawa T, Kim B, Bergaud C, Fujino M. Twin-probe vibroscanning method for dimensional measurement of microholes[J]. CIRP Annals, 1997, 46(1): 437-440. DOI: 10.1016/S0007-8506(07)60860-9.</w:t>
+      </w:r>
+    </w:p>
+    <w:p>
+      <w:pPr>
+        <w:spacing w:line="240" w:lineRule="auto" w:after="60"/>
+        <w:ind w:left="420" w:hanging="420"/>
+        <w:jc w:val="both"/>
+      </w:pPr>
+      <w:r>
+        <w:rPr>
+          <w:rFonts w:ascii="Times New Roman" w:hAnsi="Times New Roman" w:eastAsia="宋体"/>
+          <w:sz w:val="18"/>
+        </w:rPr>
+        <w:t>[53] Kim B, Masuzawa T, Bourouina T. The vibroscanning method for the measurement of micro-hole profiles[J]. Measurement Science and Technology, 1999, 10(8): 697-705. DOI: 10.1088/0957-0233/10/8/304.</w:t>
+      </w:r>
+    </w:p>
+    <w:p>
+      <w:pPr>
+        <w:spacing w:line="240" w:lineRule="auto" w:after="60"/>
+        <w:ind w:left="420" w:hanging="420"/>
+        <w:jc w:val="both"/>
+      </w:pPr>
+      <w:r>
+        <w:rPr>
+          <w:rFonts w:ascii="Times New Roman" w:hAnsi="Times New Roman" w:eastAsia="宋体"/>
+          <w:sz w:val="18"/>
+        </w:rPr>
+        <w:t>[54] Yamamoto M, Takeuchi H, Aoki S. Dimensional measurement of high aspect ratio micro structures with a resonating micro cantilever probe[J]. Microsystem Technologies, 2000, 6(5): 179-183. DOI: 10.1007/s005429900037.</w:t>
+      </w:r>
+    </w:p>
+    <w:p>
+      <w:pPr>
+        <w:spacing w:line="240" w:lineRule="auto" w:after="60"/>
+        <w:ind w:left="420" w:hanging="420"/>
+        <w:jc w:val="both"/>
+      </w:pPr>
+      <w:r>
+        <w:rPr>
+          <w:rFonts w:ascii="Times New Roman" w:hAnsi="Times New Roman" w:eastAsia="宋体"/>
+          <w:sz w:val="18"/>
+        </w:rPr>
+        <w:t>[55] Schwenke H, Wäldele F, Weiskirch C, Kunzmann H. Opto-tactile sensor for 2D and 3D measurement of small structures on coordinate measuring machines[J]. CIRP Annals, 2001, 50(1): 361-364. DOI: 10.1016/S0007-8506(07)62140-4.</w:t>
+      </w:r>
+    </w:p>
+    <w:p>
+      <w:pPr>
+        <w:spacing w:line="240" w:lineRule="auto" w:after="60"/>
+        <w:ind w:left="420" w:hanging="420"/>
+        <w:jc w:val="both"/>
+      </w:pPr>
+      <w:r>
+        <w:rPr>
+          <w:rFonts w:ascii="Times New Roman" w:hAnsi="Times New Roman" w:eastAsia="宋体"/>
+          <w:sz w:val="18"/>
+        </w:rPr>
+        <w:t>[56] Küng A, Meli F, Thalmann R. Ultraprecision micro-CMM using a low force 3D touch probe[J]. Measurement Science and Technology, 2007, 18(2): 319-327. DOI: 10.1088/0957-0233/18/2/S01.</w:t>
+      </w:r>
+    </w:p>
+    <w:p>
+      <w:pPr>
+        <w:spacing w:line="240" w:lineRule="auto" w:after="60"/>
+        <w:ind w:left="420" w:hanging="420"/>
+        <w:jc w:val="both"/>
+      </w:pPr>
+      <w:r>
+        <w:rPr>
+          <w:rFonts w:ascii="Times New Roman" w:hAnsi="Times New Roman" w:eastAsia="宋体"/>
+          <w:sz w:val="18"/>
+        </w:rPr>
+        <w:t>[57] Dai G, Bütefisch S, Pohlenz F, Danzebrink H U. A high precision micro/nano CMM using piezoresistive tactile probes[J]. Measurement Science and Technology, 2009, 20(8): 084001. DOI: 10.1088/0957-0233/20/8/084001.</w:t>
+      </w:r>
+    </w:p>
+    <w:p>
+      <w:pPr>
+        <w:spacing w:line="240" w:lineRule="auto" w:after="60"/>
+        <w:ind w:left="420" w:hanging="420"/>
+        <w:jc w:val="both"/>
+      </w:pPr>
+      <w:r>
+        <w:rPr>
+          <w:rFonts w:ascii="Times New Roman" w:hAnsi="Times New Roman" w:eastAsia="宋体"/>
+          <w:sz w:val="18"/>
+        </w:rPr>
+        <w:t>[58] Murakami H, Katsuki A, Onikura H, et al. Development of a system for measuring micro hole accuracy using an optical fiber probe[J]. Journal of Advanced Mechanical Design, Systems, and Manufacturing, 2010, 4(5): 995-1004. DOI: 10.1299/jamdsm.4.995.</w:t>
+      </w:r>
+    </w:p>
+    <w:p>
+      <w:pPr>
+        <w:spacing w:line="240" w:lineRule="auto" w:after="60"/>
+        <w:ind w:left="420" w:hanging="420"/>
+        <w:jc w:val="both"/>
+      </w:pPr>
+      <w:r>
+        <w:rPr>
+          <w:rFonts w:ascii="Times New Roman" w:hAnsi="Times New Roman" w:eastAsia="宋体"/>
+          <w:sz w:val="18"/>
+        </w:rPr>
+        <w:t>[59] Tan J, Wang F, Cui J. Fiber deflection probing method based on micro focal-length collimation[J]. Optics Express, 2010, 18(3): 2925-2933. DOI: 10.1364/OE.18.002925.</w:t>
+      </w:r>
+    </w:p>
+    <w:p>
+      <w:pPr>
+        <w:spacing w:line="240" w:lineRule="auto" w:after="60"/>
+        <w:ind w:left="420" w:hanging="420"/>
+        <w:jc w:val="both"/>
+      </w:pPr>
+      <w:r>
+        <w:rPr>
+          <w:rFonts w:ascii="Times New Roman" w:hAnsi="Times New Roman" w:eastAsia="宋体"/>
+          <w:sz w:val="18"/>
+        </w:rPr>
+        <w:t>[60] Claverley J D, Leach R K. Development of a three-dimensional vibrating tactile probe for miniature CMMs[J]. Precision Engineering, 2013, 37(2): 491-499. DOI: 10.1016/j.precisioneng.2012.12.008.</w:t>
+      </w:r>
+    </w:p>
+    <w:p>
+      <w:pPr>
+        <w:spacing w:line="240" w:lineRule="auto" w:after="60"/>
+        <w:ind w:left="420" w:hanging="420"/>
+        <w:jc w:val="both"/>
+      </w:pPr>
+      <w:r>
+        <w:rPr>
+          <w:rFonts w:ascii="Times New Roman" w:hAnsi="Times New Roman" w:eastAsia="宋体"/>
+          <w:sz w:val="18"/>
+        </w:rPr>
+        <w:t>[61] Xu M, Kirchhoff J, Brand U. Development of a traceable profilometer for high-aspect-ratio microstructures metrology[J]. Surface Topography: Metrology and Properties, 2014, 2(2): 024002. DOI: 10.1088/2051-672X/2/2/024002.</w:t>
+      </w:r>
+    </w:p>
+    <w:p>
+      <w:pPr>
+        <w:spacing w:line="240" w:lineRule="auto" w:after="60"/>
+        <w:ind w:left="420" w:hanging="420"/>
+        <w:jc w:val="both"/>
+      </w:pPr>
+      <w:r>
+        <w:rPr>
+          <w:rFonts w:ascii="Times New Roman" w:hAnsi="Times New Roman" w:eastAsia="宋体"/>
+          <w:sz w:val="18"/>
+        </w:rPr>
+        <w:t>[62] Cui J, Bian X, He Z, Li L, Sun T. A 3D nano-resolution scanning probe for measurement of small structures with high aspect ratio[J]. Sensors and Actuators A: Physical, 2015, 235: 187-193. DOI: 10.1016/j.sna.2015.10.005.</w:t>
+      </w:r>
+    </w:p>
+    <w:p>
+      <w:pPr>
+        <w:spacing w:line="240" w:lineRule="auto" w:after="60"/>
+        <w:ind w:left="420" w:hanging="420"/>
+        <w:jc w:val="both"/>
+      </w:pPr>
+      <w:r>
+        <w:rPr>
+          <w:rFonts w:ascii="Times New Roman" w:hAnsi="Times New Roman" w:eastAsia="宋体"/>
+          <w:sz w:val="18"/>
+        </w:rPr>
+        <w:t>[63] Ito S, Kikuchi H, Chen Y, et al. A micro-coordinate measurement machine for large-scale dimensional measurement of micro-slits[J]. Applied Sciences, 2016, 6(5): 156. DOI: 10.3390/app6050156.</w:t>
+      </w:r>
+    </w:p>
+    <w:p>
+      <w:pPr>
+        <w:spacing w:line="240" w:lineRule="auto" w:after="60"/>
+        <w:ind w:left="420" w:hanging="420"/>
+        <w:jc w:val="both"/>
+      </w:pPr>
+      <w:r>
+        <w:rPr>
+          <w:rFonts w:ascii="Times New Roman" w:hAnsi="Times New Roman" w:eastAsia="宋体"/>
+          <w:sz w:val="18"/>
+        </w:rPr>
+        <w:t>[64] Elfurjani S, Ko J, Jun M B G. Micro-scale hole profile measurement using rotating wire probe and acoustic emission contact detection[J]. Measurement, 2016, 89: 215-222. DOI: 10.1016/j.measurement.2016.04.023.</w:t>
+      </w:r>
+    </w:p>
+    <w:p>
+      <w:pPr>
+        <w:spacing w:line="240" w:lineRule="auto" w:after="60"/>
+        <w:ind w:left="420" w:hanging="420"/>
+        <w:jc w:val="both"/>
+      </w:pPr>
+      <w:r>
+        <w:rPr>
+          <w:rFonts w:ascii="Times New Roman" w:hAnsi="Times New Roman" w:eastAsia="宋体"/>
+          <w:sz w:val="18"/>
+        </w:rPr>
+        <w:t>[65] Chen Y, Cui J, Tan J. Spherical coupling probe for measuring inner dimensions of microstructures[J]. Optics Express, 2018, 26(26): 33523-33533. DOI: 10.1364/OE.26.033523.</w:t>
+      </w:r>
+    </w:p>
+    <w:p>
+      <w:pPr>
+        <w:spacing w:line="240" w:lineRule="auto" w:after="60"/>
+        <w:ind w:left="420" w:hanging="420"/>
+        <w:jc w:val="both"/>
+      </w:pPr>
+      <w:r>
+        <w:rPr>
+          <w:rFonts w:ascii="Times New Roman" w:hAnsi="Times New Roman" w:eastAsia="宋体"/>
+          <w:sz w:val="18"/>
+        </w:rPr>
+        <w:t>[66] Fang C, Huang Q, Ding X, et al. Measurement and uncertainty evaluation of the microsphere used for micro-CMM probe[J]. Measurement Science and Technology, 2020, 31(2): 025004. DOI: 10.1088/1361-6501/ab46f0.</w:t>
+      </w:r>
+    </w:p>
+    <w:p>
+      <w:pPr>
+        <w:spacing w:line="240" w:lineRule="auto" w:after="60"/>
+        <w:ind w:left="420" w:hanging="420"/>
+        <w:jc w:val="both"/>
+      </w:pPr>
+      <w:r>
+        <w:rPr>
+          <w:rFonts w:ascii="Times New Roman" w:hAnsi="Times New Roman" w:eastAsia="宋体"/>
+          <w:sz w:val="18"/>
+        </w:rPr>
+        <w:t>[67] He Y X, Lin R W, Li J, et al. Nanoprecision measurement of high-aspect-ratio microholes using sub-100-μm tungsten ball tip[J]. IEEE Sensors Journal, 2023, 23(24): 30893-30902. DOI: 10.1109/JSEN.2023.3330394.</w:t>
+      </w:r>
+    </w:p>
+    <w:p>
+      <w:pPr>
+        <w:spacing w:line="240" w:lineRule="auto" w:after="60"/>
+        <w:ind w:left="420" w:hanging="420"/>
+        <w:jc w:val="both"/>
+      </w:pPr>
+      <w:r>
+        <w:rPr>
+          <w:rFonts w:ascii="Times New Roman" w:hAnsi="Times New Roman" w:eastAsia="宋体"/>
+          <w:sz w:val="18"/>
+        </w:rPr>
+        <w:t>[68] Wang D, Liu H, Cheng X. A miniature binocular endoscope with local feature matching and stereo matching for 3D measurement and 3D reconstruction[J]. Sensors, 2018, 18(7): 2243. DOI: 10.3390/s18072243.</w:t>
+      </w:r>
+    </w:p>
+    <w:p>
+      <w:pPr>
+        <w:spacing w:line="240" w:lineRule="auto" w:after="60"/>
+        <w:ind w:left="420" w:hanging="420"/>
+        <w:jc w:val="both"/>
+      </w:pPr>
+      <w:r>
+        <w:rPr>
+          <w:rFonts w:ascii="Times New Roman" w:hAnsi="Times New Roman" w:eastAsia="宋体"/>
+          <w:sz w:val="18"/>
+        </w:rPr>
+        <w:t>[69] Zhou F, Wang Y, Liu L, Cui Y, Gao H. Three-dimensional measurement approach in small FOV and confined space using an electronic endoscope[J]. IEEE Sensors Journal, 2014, 14(9): 3274-3282. DOI: 10.1109/JSEN.2014.2328339.</w:t>
+      </w:r>
+    </w:p>
+    <w:p>
+      <w:pPr>
+        <w:spacing w:line="240" w:lineRule="auto" w:after="60"/>
+        <w:ind w:left="420" w:hanging="420"/>
+        <w:jc w:val="both"/>
+      </w:pPr>
+      <w:r>
+        <w:rPr>
+          <w:rFonts w:ascii="Times New Roman" w:hAnsi="Times New Roman" w:eastAsia="宋体"/>
+          <w:sz w:val="18"/>
+        </w:rPr>
+        <w:t>[70] Zhang D, Jackson W, Dobie G, West G, MacLeod C. Structure-from-motion based image unwrapping and stitching for small bore pipe inspections[J]. Computers in Industry, 2022, 139: 103664. DOI: 10.1016/j.compind.2022.103664.</w:t>
+      </w:r>
+    </w:p>
+    <w:p>
+      <w:pPr>
+        <w:spacing w:line="240" w:lineRule="auto" w:after="60"/>
+        <w:ind w:left="420" w:hanging="420"/>
+        <w:jc w:val="both"/>
+      </w:pPr>
+      <w:r>
+        <w:rPr>
+          <w:rFonts w:ascii="Times New Roman" w:hAnsi="Times New Roman" w:eastAsia="宋体"/>
+          <w:sz w:val="18"/>
+        </w:rPr>
+        <w:t>[71] Gorevoy A V, Machikhin A S, Khokhlov D D, et al. Applying a ray tracing model of an optoelectronic system to improve the accuracy of endoscopic measurements[J]. Russian Journal of Nondestructive Testing, 2017, 53(9): 660-668. DOI: 10.1134/S1061830917090054.</w:t>
+      </w:r>
+    </w:p>
+    <w:p>
+      <w:pPr>
+        <w:spacing w:line="240" w:lineRule="auto" w:after="60"/>
+        <w:ind w:left="420" w:hanging="420"/>
+        <w:jc w:val="both"/>
+      </w:pPr>
+      <w:r>
+        <w:rPr>
+          <w:rFonts w:ascii="Times New Roman" w:hAnsi="Times New Roman" w:eastAsia="宋体"/>
+          <w:sz w:val="18"/>
+        </w:rPr>
+        <w:t>[72] Gorevoy A V, Machikhin A S, Khokhlov D D, Batshev V I. Modeling and optimization of a geometrical calibration procedure for stereoscopic video endoscopes[J]. Journal of the Optical Society of America A, 2019, 36(11): 1871-1881. DOI: 10.1364/JOSAA.36.001871.</w:t>
+      </w:r>
+    </w:p>
+    <w:p>
+      <w:pPr>
+        <w:spacing w:line="240" w:lineRule="auto" w:after="60"/>
+        <w:ind w:left="420" w:hanging="420"/>
+        <w:jc w:val="both"/>
+      </w:pPr>
+      <w:r>
+        <w:rPr>
+          <w:rFonts w:ascii="Times New Roman" w:hAnsi="Times New Roman" w:eastAsia="宋体"/>
+          <w:sz w:val="18"/>
+        </w:rPr>
+        <w:t>[73] Yi Z, Chen Z, Jiang Z, Gui W. A novel 3-D high-temperature industrial endoscope with large field depth and wide field[J]. IEEE Transactions on Instrumentation and Measurement, 2020, 69(9): 6530-6543. DOI: 10.1109/TIM.2020.2970372.</w:t>
+      </w:r>
+    </w:p>
+    <w:p>
+      <w:pPr>
+        <w:spacing w:line="240" w:lineRule="auto" w:after="60"/>
+        <w:ind w:left="420" w:hanging="420"/>
+        <w:jc w:val="both"/>
+      </w:pPr>
+      <w:r>
+        <w:rPr>
+          <w:rFonts w:ascii="Times New Roman" w:hAnsi="Times New Roman" w:eastAsia="宋体"/>
+          <w:sz w:val="18"/>
+        </w:rPr>
+        <w:t>[74] Guo W, Zhou F, Tan H, et al. Multidirectional stereo vision sensor with catadioptric units for measuring geometric parameters of pipeline inner walls[J]. IEEE Transactions on Instrumentation and Measurement, 2025, 74: 1-13. DOI: 10.1109/TIM.2025.3545538.</w:t>
+      </w:r>
+    </w:p>
+    <w:p>
+      <w:pPr>
+        <w:spacing w:line="240" w:lineRule="auto" w:after="60"/>
+        <w:ind w:left="420" w:hanging="420"/>
+        <w:jc w:val="both"/>
+      </w:pPr>
+      <w:r>
+        <w:rPr>
+          <w:rFonts w:ascii="Times New Roman" w:hAnsi="Times New Roman" w:eastAsia="宋体"/>
+          <w:sz w:val="18"/>
+        </w:rPr>
+        <w:t>[75] Pösch A, Schlobohm J, Matthias S, Reithmeier E. Rigid and flexible endoscopes for three dimensional measurement of inside machine parts using fringe projection[J]. Optics and Lasers in Engineering, 2017, 89: 178-183. DOI: 10.1016/j.optlaseng.2016.05.023.</w:t>
+      </w:r>
+    </w:p>
+    <w:p>
+      <w:pPr>
+        <w:spacing w:line="240" w:lineRule="auto" w:after="60"/>
+        <w:ind w:left="420" w:hanging="420"/>
+        <w:jc w:val="both"/>
+      </w:pPr>
+      <w:r>
+        <w:rPr>
+          <w:rFonts w:ascii="Times New Roman" w:hAnsi="Times New Roman" w:eastAsia="宋体"/>
+          <w:sz w:val="18"/>
+        </w:rPr>
+        <w:t>[76] Matthias S, Schlobohm J, Kästner M, Reithmeier E. Fringe projection profilometry using rigid and flexible endoscopes[J]. tm—Technisches Messen, 2017, 84(2): 123-129. DOI: 10.1515/teme-2016-0054.</w:t>
+      </w:r>
+    </w:p>
+    <w:p>
+      <w:pPr>
+        <w:spacing w:line="240" w:lineRule="auto" w:after="60"/>
+        <w:ind w:left="420" w:hanging="420"/>
+        <w:jc w:val="both"/>
+      </w:pPr>
+      <w:r>
+        <w:rPr>
+          <w:rFonts w:ascii="Times New Roman" w:hAnsi="Times New Roman" w:eastAsia="宋体"/>
+          <w:sz w:val="18"/>
+        </w:rPr>
+        <w:t>[77] Matthias S, Kästner M, Reithmeier E. A 3D measuring endoscope for hand-guided operation[J]. Measurement Science and Technology, 2018, 29(9): 094001. DOI: 10.1088/1361-6501/aad1e1.</w:t>
+      </w:r>
+    </w:p>
+    <w:p>
+      <w:pPr>
+        <w:spacing w:line="240" w:lineRule="auto" w:after="60"/>
+        <w:ind w:left="420" w:hanging="420"/>
+        <w:jc w:val="both"/>
+      </w:pPr>
+      <w:r>
+        <w:rPr>
+          <w:rFonts w:ascii="Times New Roman" w:hAnsi="Times New Roman" w:eastAsia="宋体"/>
+          <w:sz w:val="18"/>
+        </w:rPr>
+        <w:t>[78] Hinz L, Kästner M, Reithmeier E. Metal forming tool monitoring based on a 3D measuring endoscope using CAD assisted registration[J]. Sensors, 2019, 19(9): 2084. DOI: 10.3390/s19092084.</w:t>
+      </w:r>
+    </w:p>
+    <w:p>
+      <w:pPr>
+        <w:spacing w:line="240" w:lineRule="auto" w:after="60"/>
+        <w:ind w:left="420" w:hanging="420"/>
+        <w:jc w:val="both"/>
+      </w:pPr>
+      <w:r>
+        <w:rPr>
+          <w:rFonts w:ascii="Times New Roman" w:hAnsi="Times New Roman" w:eastAsia="宋体"/>
+          <w:sz w:val="18"/>
+        </w:rPr>
+        <w:t>[79] Middendorf P, Hedrich K, Kästner M, Reithmeier E. Miniaturization of borescopic fringe projection systems for the inspection in confined spaces: A methodical analysis[C]//Proceedings of SPIE. 2021. DOI: 10.1117/12.2583148.</w:t>
+      </w:r>
+    </w:p>
+    <w:p>
+      <w:pPr>
+        <w:spacing w:line="240" w:lineRule="auto" w:after="60"/>
+        <w:ind w:left="420" w:hanging="420"/>
+        <w:jc w:val="both"/>
+      </w:pPr>
+      <w:r>
+        <w:rPr>
+          <w:rFonts w:ascii="Times New Roman" w:hAnsi="Times New Roman" w:eastAsia="宋体"/>
+          <w:sz w:val="18"/>
+        </w:rPr>
+        <w:t>[80] Albertazzi A G Jr, Hofmann A C, Fantin A V, Santos J M C. Photogrammetric endoscope for measurement of inner cylindrical surfaces using fringe projection[J]. Applied Optics, 2008, 47(21): 3868-3876. DOI: 10.1364/AO.47.003868.</w:t>
+      </w:r>
+    </w:p>
+    <w:p>
+      <w:pPr>
+        <w:spacing w:line="240" w:lineRule="auto" w:after="60"/>
+        <w:ind w:left="420" w:hanging="420"/>
+        <w:jc w:val="both"/>
+      </w:pPr>
+      <w:r>
+        <w:rPr>
+          <w:rFonts w:ascii="Times New Roman" w:hAnsi="Times New Roman" w:eastAsia="宋体"/>
+          <w:sz w:val="18"/>
+        </w:rPr>
+        <w:t>[81] Inari T, Takashima K, Watanabe M, Fujimoto J. Optical inspection system for the inner surface of a pipe using detection of circular images projected by a laser source[J]. Measurement, 1994, 13(2): 99-106. DOI: 10.1016/0263-2241(94)90003-5.</w:t>
+      </w:r>
+    </w:p>
+    <w:p>
+      <w:pPr>
+        <w:spacing w:line="240" w:lineRule="auto" w:after="60"/>
+        <w:ind w:left="420" w:hanging="420"/>
+        <w:jc w:val="both"/>
+      </w:pPr>
+      <w:r>
+        <w:rPr>
+          <w:rFonts w:ascii="Times New Roman" w:hAnsi="Times New Roman" w:eastAsia="宋体"/>
+          <w:sz w:val="18"/>
+        </w:rPr>
+        <w:t>[82] Zhang G, He J, Li X. 3D vision inspection for internal surface based on circle structured light[J]. Sensors and Actuators A: Physical, 2005, 122(1): 68-75. DOI: 10.1016/j.sna.2005.04.012.</w:t>
+      </w:r>
+    </w:p>
+    <w:p>
+      <w:pPr>
+        <w:spacing w:line="240" w:lineRule="auto" w:after="60"/>
+        <w:ind w:left="420" w:hanging="420"/>
+        <w:jc w:val="both"/>
+      </w:pPr>
+      <w:r>
+        <w:rPr>
+          <w:rFonts w:ascii="Times New Roman" w:hAnsi="Times New Roman" w:eastAsia="宋体"/>
+          <w:sz w:val="18"/>
+        </w:rPr>
+        <w:t>[83] Yoshizawa T, Yamamoto M, Wakayama T. Inner profile measurement of pipes and holes using a ring beam device[C]//Proceedings of SPIE. 2006, 6382: 63820D. DOI: 10.1117/12.689317.</w:t>
+      </w:r>
+    </w:p>
+    <w:p>
+      <w:pPr>
+        <w:spacing w:line="240" w:lineRule="auto" w:after="60"/>
+        <w:ind w:left="420" w:hanging="420"/>
+        <w:jc w:val="both"/>
+      </w:pPr>
+      <w:r>
+        <w:rPr>
+          <w:rFonts w:ascii="Times New Roman" w:hAnsi="Times New Roman" w:eastAsia="宋体"/>
+          <w:sz w:val="18"/>
+        </w:rPr>
+        <w:t>[84] Zhu Y, Gu Y, Jin Y, Zhai C. Flexible calibration method for an inner surface detector based on circle structured light[J]. Applied Optics, 2016, 55(5): 1034-1040. DOI: 10.1364/AO.55.001034.</w:t>
+      </w:r>
+    </w:p>
+    <w:p>
+      <w:pPr>
+        <w:spacing w:line="240" w:lineRule="auto" w:after="60"/>
+        <w:ind w:left="420" w:hanging="420"/>
+        <w:jc w:val="both"/>
+      </w:pPr>
+      <w:r>
+        <w:rPr>
+          <w:rFonts w:ascii="Times New Roman" w:hAnsi="Times New Roman" w:eastAsia="宋体"/>
+          <w:sz w:val="18"/>
+        </w:rPr>
+        <w:t>[85] Dong Y, Fang C, Zhu L, Yan N, Zhang X. The calibration method of the circle-structured light measurement system for inner surfaces considering systematic errors[J]. Measurement Science and Technology, 2021, 32(7): 075012. DOI: 10.1088/1361-6501/abe288.</w:t>
+      </w:r>
+    </w:p>
+    <w:p>
+      <w:pPr>
+        <w:spacing w:line="240" w:lineRule="auto" w:after="60"/>
+        <w:ind w:left="420" w:hanging="420"/>
+        <w:jc w:val="both"/>
+      </w:pPr>
+      <w:r>
+        <w:rPr>
+          <w:rFonts w:ascii="Times New Roman" w:hAnsi="Times New Roman" w:eastAsia="宋体"/>
+          <w:sz w:val="18"/>
+        </w:rPr>
+        <w:t>[86] Zhao H, Zhang Z, Fan M, Xia H, Yu L. Calibration of a circular structured light measurement system based on a multi-diameter calibrator[J]. Measurement Science and Technology, 2023, 34(6): 065017. DOI: 10.1088/1361-6501/acc269.</w:t>
+      </w:r>
+    </w:p>
+    <w:p>
+      <w:pPr>
+        <w:spacing w:line="240" w:lineRule="auto" w:after="60"/>
+        <w:ind w:left="420" w:hanging="420"/>
+        <w:jc w:val="both"/>
+      </w:pPr>
+      <w:r>
+        <w:rPr>
+          <w:rFonts w:ascii="Times New Roman" w:hAnsi="Times New Roman" w:eastAsia="宋体"/>
+          <w:sz w:val="18"/>
+        </w:rPr>
+        <w:t>[87] Pan S, Shao X, Wang H, Song B. A three-dimensional reconstruction method for the inner surface of a deep hole using a rotating mechanism[J]. Review of Scientific Instruments, 2021, 92(10): 105010. DOI: 10.1063/5.0058223.</w:t>
+      </w:r>
+    </w:p>
+    <w:p>
+      <w:pPr>
+        <w:spacing w:line="240" w:lineRule="auto" w:after="60"/>
+        <w:ind w:left="420" w:hanging="420"/>
+        <w:jc w:val="both"/>
+      </w:pPr>
+      <w:r>
+        <w:rPr>
+          <w:rFonts w:ascii="Times New Roman" w:hAnsi="Times New Roman" w:eastAsia="宋体"/>
+          <w:sz w:val="18"/>
+        </w:rPr>
+        <w:t>[88] Hošek J, Linduška P. Simple modification of a commercial laser triangulation sensor for distance measurement of slot and bore side surfaces[J]. Sensors, 2021, 21(20): 6911. DOI: 10.3390/s21206911.</w:t>
+      </w:r>
+    </w:p>
+    <w:p>
+      <w:pPr>
+        <w:spacing w:line="240" w:lineRule="auto" w:after="60"/>
+        <w:ind w:left="420" w:hanging="420"/>
+        <w:jc w:val="both"/>
+      </w:pPr>
+      <w:r>
+        <w:rPr>
+          <w:rFonts w:ascii="Times New Roman" w:hAnsi="Times New Roman" w:eastAsia="宋体"/>
+          <w:sz w:val="18"/>
+        </w:rPr>
+        <w:t>[89] Li X, Wang Y, Ni N, Yang R, Xie G. Multi-ring beam sensing system for three-dimensional measurement of the narrow inner surface profiles[C]//2022 Asia Communications and Photonics Conference. 2022: 1434-1437. DOI: 10.1109/ACP55869.2022.10088906.</w:t>
+      </w:r>
+    </w:p>
+    <w:p>
+      <w:pPr>
+        <w:spacing w:line="240" w:lineRule="auto" w:after="60"/>
+        <w:ind w:left="420" w:hanging="420"/>
+        <w:jc w:val="both"/>
+      </w:pPr>
+      <w:r>
+        <w:rPr>
+          <w:rFonts w:ascii="Times New Roman" w:hAnsi="Times New Roman" w:eastAsia="宋体"/>
+          <w:sz w:val="18"/>
+        </w:rPr>
+        <w:t>[90] Zhao X, Du H, Yu D. Improving measurement accuracy of deep hole measurement instruments through perspective transformation[J]. Sensors, 2024, 24(10): 3158. DOI: 10.3390/s24103158.</w:t>
+      </w:r>
+    </w:p>
+    <w:p>
+      <w:pPr>
+        <w:spacing w:line="240" w:lineRule="auto" w:after="60"/>
+        <w:ind w:left="420" w:hanging="420"/>
+        <w:jc w:val="both"/>
+      </w:pPr>
+      <w:r>
+        <w:rPr>
+          <w:rFonts w:ascii="Times New Roman" w:hAnsi="Times New Roman" w:eastAsia="宋体"/>
+          <w:sz w:val="18"/>
+        </w:rPr>
+        <w:t>[91] Du H, Zhao X, Yu D, Shi H, Zhou Z. Research on point cloud acquisition and calibration of deep hole inner surfaces based on collimated ring laser beams[J]. Sensors, 2024, 24(17): 5790. DOI: 10.3390/s24175790.</w:t>
+      </w:r>
+    </w:p>
+    <w:p>
+      <w:pPr>
+        <w:spacing w:line="240" w:lineRule="auto" w:after="60"/>
+        <w:ind w:left="420" w:hanging="420"/>
+        <w:jc w:val="both"/>
+      </w:pPr>
+      <w:r>
+        <w:rPr>
+          <w:rFonts w:ascii="Times New Roman" w:hAnsi="Times New Roman" w:eastAsia="宋体"/>
+          <w:sz w:val="18"/>
+        </w:rPr>
+        <w:t>[92] 马瑞, 吴柏荣, 李保文, 李星辉. 基于光谱共焦原理的大深径比内孔参数旋转测量方法[J]. 激光与光电子学进展, 2025, 62(7): 0712003. DOI: 10.3788/LOP242214.</w:t>
+      </w:r>
+    </w:p>
+    <w:p>
+      <w:pPr>
+        <w:spacing w:line="240" w:lineRule="auto" w:after="60"/>
+        <w:ind w:left="420" w:hanging="420"/>
+        <w:jc w:val="both"/>
+      </w:pPr>
+      <w:r>
+        <w:rPr>
+          <w:rFonts w:ascii="Times New Roman" w:hAnsi="Times New Roman" w:eastAsia="宋体"/>
+          <w:sz w:val="18"/>
+        </w:rPr>
+        <w:t>[93] Liu Y, Wang G, Yu D, Du H. A spectral confocal measurement method for high-aspect-ratio deep holes based on stepped ring gauge and hierarchical error compensation[J]. Sensors, 2026, 26(11): 3384. DOI: 10.3390/s26113384.</w:t>
+      </w:r>
+    </w:p>
+    <w:p>
+      <w:pPr>
+        <w:spacing w:line="240" w:lineRule="auto" w:after="60"/>
+        <w:ind w:left="420" w:hanging="420"/>
+        <w:jc w:val="both"/>
+      </w:pPr>
+      <w:r>
+        <w:rPr>
+          <w:rFonts w:ascii="Times New Roman" w:hAnsi="Times New Roman" w:eastAsia="宋体"/>
+          <w:sz w:val="18"/>
+        </w:rPr>
+        <w:t>[94] Depiereux F, Lehmann P, Pfeifer T, Schmitt R. Fiber-optical sensor with miniaturized probe head and nanometer accuracy based on spatially modulated low-coherence interferogram analysis[J]. Applied Optics, 2007, 46(17): 3425-3431. DOI: 10.1364/AO.46.003425.</w:t>
+      </w:r>
+    </w:p>
+    <w:p>
+      <w:pPr>
+        <w:spacing w:line="240" w:lineRule="auto" w:after="60"/>
+        <w:ind w:left="420" w:hanging="420"/>
+        <w:jc w:val="both"/>
+      </w:pPr>
+      <w:r>
+        <w:rPr>
+          <w:rFonts w:ascii="Times New Roman" w:hAnsi="Times New Roman" w:eastAsia="宋体"/>
+          <w:sz w:val="18"/>
+        </w:rPr>
+        <w:t>[95] Schmitt R, König N, Depiereux F. Miniaturization and evaluation of fiber optic probes for low-coherence interferometry[C]//Proceedings of SPIE. 2008, 7003: 700304. DOI: 10.1117/12.780535.</w:t>
+      </w:r>
+    </w:p>
+    <w:p>
+      <w:pPr>
+        <w:spacing w:line="240" w:lineRule="auto" w:after="60"/>
+        <w:ind w:left="420" w:hanging="420"/>
+        <w:jc w:val="both"/>
+      </w:pPr>
+      <w:r>
+        <w:rPr>
+          <w:rFonts w:ascii="Times New Roman" w:hAnsi="Times New Roman" w:eastAsia="宋体"/>
+          <w:sz w:val="18"/>
+        </w:rPr>
+        <w:t>[96] Ford H D, Tatam R P. Passive OCT probe head for 3D duct inspection[J]. Measurement Science and Technology, 2013, 24(9): 094001. DOI: 10.1088/0957-0233/24/9/094001.</w:t>
+      </w:r>
+    </w:p>
+    <w:p>
+      <w:pPr>
+        <w:spacing w:line="240" w:lineRule="auto" w:after="60"/>
+        <w:ind w:left="420" w:hanging="420"/>
+        <w:jc w:val="both"/>
+      </w:pPr>
+      <w:r>
+        <w:rPr>
+          <w:rFonts w:ascii="Times New Roman" w:hAnsi="Times New Roman" w:eastAsia="宋体"/>
+          <w:sz w:val="18"/>
+        </w:rPr>
+        <w:t>[97] Liu Z, Zhong Q, Yu X, Wang Q J, Zhang Y. High-resolution fiber profilometer for hard-to-access areas[J]. Applied Optics, 2015, 54(24): 7205-7212. DOI: 10.1364/AO.54.007205.</w:t>
+      </w:r>
+    </w:p>
+    <w:p>
+      <w:pPr>
+        <w:spacing w:line="240" w:lineRule="auto" w:after="60"/>
+        <w:ind w:left="420" w:hanging="420"/>
+        <w:jc w:val="both"/>
+      </w:pPr>
+      <w:r>
+        <w:rPr>
+          <w:rFonts w:ascii="Times New Roman" w:hAnsi="Times New Roman" w:eastAsia="宋体"/>
+          <w:sz w:val="18"/>
+        </w:rPr>
+        <w:t>[98] Asada T, Yamazaki H. Development of a 3-dimensional precision measuring method by optical endoscope: Evaluation of measuring accuracy of inner wall based on quartz pipe surface[J]. Transactions of the JSME, 2018, 84(857): 16-00492. DOI: 10.1299/transjsme.16-00492.</w:t>
+      </w:r>
+    </w:p>
+    <w:p>
+      <w:pPr>
+        <w:spacing w:line="240" w:lineRule="auto" w:after="60"/>
+        <w:ind w:left="420" w:hanging="420"/>
+        <w:jc w:val="both"/>
+      </w:pPr>
+      <w:r>
+        <w:rPr>
+          <w:rFonts w:ascii="Times New Roman" w:hAnsi="Times New Roman" w:eastAsia="宋体"/>
+          <w:sz w:val="18"/>
+        </w:rPr>
+        <w:t>[99] Song C, Jiao L, Wang X, et al. Development and testing of a multi-sensor measurement system for roundness and axis straightness errors of deep-hole parts[J]. Measurement, 2022, 198: 111069. DOI: 10.1016/j.measurement.2022.111069.</w:t>
+      </w:r>
+    </w:p>
+    <w:p>
+      <w:pPr>
+        <w:spacing w:line="240" w:lineRule="auto" w:after="60"/>
+        <w:ind w:left="420" w:hanging="420"/>
+        <w:jc w:val="both"/>
+      </w:pPr>
+      <w:r>
+        <w:rPr>
+          <w:rFonts w:ascii="Times New Roman" w:hAnsi="Times New Roman" w:eastAsia="宋体"/>
+          <w:sz w:val="18"/>
+        </w:rPr>
+        <w:t>[100] Katsuki A, Sajima T, Murakami H, et al. Development of a laser-guiding-type deep small-sized hole-measurement system: Measurement accuracy[J]. Precision Engineering, 2020, 63: 18-32. DOI: 10.1016/j.precisioneng.2019.12.012.</w:t>
+      </w:r>
+    </w:p>
+    <w:p>
+      <w:pPr>
+        <w:spacing w:line="240" w:lineRule="auto" w:after="60"/>
+        <w:ind w:left="420" w:hanging="420"/>
+        <w:jc w:val="both"/>
+      </w:pPr>
+      <w:r>
+        <w:rPr>
+          <w:rFonts w:ascii="Times New Roman" w:hAnsi="Times New Roman" w:eastAsia="宋体"/>
+          <w:sz w:val="18"/>
+        </w:rPr>
+        <w:t>[101] Liang J, Song X, Wang K, Han X. An on-machine measuring apparatus for dimension and form errors of deep-hole parts[J]. Sensors, 2024, 24(23): 7847. DOI: 10.3390/s24237847.</w:t>
+      </w:r>
+    </w:p>
+    <w:p>
+      <w:pPr>
+        <w:spacing w:line="240" w:lineRule="auto" w:after="60"/>
+        <w:ind w:left="420" w:hanging="420"/>
+        <w:jc w:val="both"/>
+      </w:pPr>
+      <w:r>
+        <w:rPr>
+          <w:rFonts w:ascii="Times New Roman" w:hAnsi="Times New Roman" w:eastAsia="宋体"/>
+          <w:sz w:val="18"/>
+        </w:rPr>
+        <w:t>[102] Gong Y, Johnston R S, Melville C D, Seibel E J. Axial-stereo 3-D optical metrology for inner profile of pipes using a scanning laser endoscope[J]. International Journal of Optomechatronics, 2015, 9(3): 238-247. DOI: 10.1080/15599612.2015.1059535.</w:t>
+      </w:r>
+    </w:p>
+    <w:p>
+      <w:pPr>
+        <w:spacing w:line="240" w:lineRule="auto" w:after="60"/>
+        <w:ind w:left="420" w:hanging="420"/>
+        <w:jc w:val="both"/>
+      </w:pPr>
+      <w:r>
+        <w:rPr>
+          <w:rFonts w:ascii="Times New Roman" w:hAnsi="Times New Roman" w:eastAsia="宋体"/>
+          <w:sz w:val="18"/>
+        </w:rPr>
+        <w:t>[103] Shang Z, Shen Z. Single-pass inline pipeline 3D reconstruction using depth camera array[J]. Automation in Construction, 2022, 138: 104231. DOI: 10.1016/j.autcon.2022.104231.</w:t>
+      </w:r>
+    </w:p>
+    <w:p>
+      <w:pPr>
+        <w:spacing w:line="240" w:lineRule="auto" w:after="60"/>
+        <w:ind w:left="420" w:hanging="420"/>
+        <w:jc w:val="both"/>
+      </w:pPr>
+      <w:r>
+        <w:rPr>
+          <w:rFonts w:ascii="Times New Roman" w:hAnsi="Times New Roman" w:eastAsia="宋体"/>
+          <w:sz w:val="18"/>
+        </w:rPr>
+        <w:t>[104] Yan S, Shi J, Li G, et al. Advances in aeroengine cooling hole measurement: A comprehensive review[J]. Sensors, 2024, 24(7): 2152. DOI: 10.3390/s24072152.</w:t>
+      </w:r>
+    </w:p>
+    <w:p>
+      <w:pPr>
+        <w:spacing w:line="240" w:lineRule="auto" w:after="60"/>
+        <w:ind w:left="420" w:hanging="420"/>
+        <w:jc w:val="both"/>
+      </w:pPr>
+      <w:r>
+        <w:rPr>
+          <w:rFonts w:ascii="Times New Roman" w:hAnsi="Times New Roman" w:eastAsia="宋体"/>
+          <w:sz w:val="18"/>
+        </w:rPr>
+        <w:t>[105] Munkelt C, Kühmstedt P, Aschermann L, Seidel F. Automatic complete high-precision optical 3D measurement of air cooling-holes of gas turbine vanes for repair[C]//Proceedings of SPIE. 2015, 9525: 952512. DOI: 10.1117/12.2184709.</w:t>
+      </w:r>
+    </w:p>
+    <w:p>
+      <w:pPr>
+        <w:spacing w:line="240" w:lineRule="auto" w:after="60"/>
+        <w:ind w:left="420" w:hanging="420"/>
+        <w:jc w:val="both"/>
+      </w:pPr>
+      <w:r>
+        <w:rPr>
+          <w:rFonts w:ascii="Times New Roman" w:hAnsi="Times New Roman" w:eastAsia="宋体"/>
+          <w:sz w:val="18"/>
+        </w:rPr>
+        <w:t>[106] Yu B, Ke H, Shen E, Zhang T. A review of blade tip clearance-measuring technologies for gas turbine engines[J]. Measurement and Control, 2020, 53(3-4): 339-357. DOI: 10.1177/0020294019877514.</w:t>
+      </w:r>
+    </w:p>
+    <w:p>
+      <w:pPr>
+        <w:spacing w:line="240" w:lineRule="auto" w:after="60"/>
+        <w:ind w:left="420" w:hanging="420"/>
+        <w:jc w:val="both"/>
+      </w:pPr>
+      <w:r>
+        <w:rPr>
+          <w:rFonts w:ascii="Times New Roman" w:hAnsi="Times New Roman" w:eastAsia="宋体"/>
+          <w:sz w:val="18"/>
+        </w:rPr>
+        <w:t>[107] Zhao Z, Zhao L, Lyu Y, Liu Z. Experimental verification of high-temperature resistance and high resolution of inductive tip clearance measurement system[J]. Sensors, 2025, 25(10): 3145. DOI: 10.3390/s25103145.</w:t>
+      </w:r>
+    </w:p>
+    <w:p>
+      <w:pPr>
+        <w:spacing w:line="240" w:lineRule="auto" w:after="60"/>
+        <w:ind w:left="420" w:hanging="420"/>
+        <w:jc w:val="both"/>
+      </w:pPr>
+      <w:r>
+        <w:rPr>
+          <w:rFonts w:ascii="Times New Roman" w:hAnsi="Times New Roman" w:eastAsia="宋体"/>
+          <w:sz w:val="18"/>
+        </w:rPr>
+        <w:t>[108] Gao Y, Kyle S, Lin J, et al. Laser tracker orientation in confined space using on-board targets[J]. Measurement Science and Technology, 2016, 27(8): 085010. DOI: 10.1088/0957-0233/27/8/085010.</w:t>
+      </w:r>
+    </w:p>
+    <w:p>
+      <w:pPr>
+        <w:spacing w:line="240" w:lineRule="auto" w:after="60"/>
+        <w:ind w:left="420" w:hanging="420"/>
+        <w:jc w:val="both"/>
+      </w:pPr>
+      <w:r>
+        <w:rPr>
+          <w:rFonts w:ascii="Times New Roman" w:hAnsi="Times New Roman" w:eastAsia="宋体"/>
+          <w:sz w:val="18"/>
+        </w:rPr>
+        <w:t>[109] Han L, Yu L, Zhu X. A novel method for pose and position calibration of laser displacement sensors[J]. Sensors, 2023, 23(4): 1762. DOI: 10.3390/s23041762.</w:t>
+      </w:r>
+    </w:p>
+    <w:p>
+      <w:pPr>
+        <w:spacing w:line="240" w:lineRule="auto" w:after="60"/>
+        <w:ind w:left="420" w:hanging="420"/>
+        <w:jc w:val="both"/>
+      </w:pPr>
+      <w:r>
+        <w:rPr>
+          <w:rFonts w:ascii="Times New Roman" w:hAnsi="Times New Roman" w:eastAsia="宋体"/>
+          <w:sz w:val="18"/>
+        </w:rPr>
+        <w:t>[110] Zhang B, Jiang K, Lin J. A novel in situ calibration method based on virtual planes for fringe projection profilometry[J]. IEEE Transactions on Instrumentation and Measurement, 2024, 73: 1-8. DOI: 10.1109/TIM.2024.3390210.</w:t>
       </w:r>
     </w:p>
     <w:sectPr>

</xml_diff>